<commit_message>
N.D. Ga. motion brief: typst and docx on the shared cross-engine layout model, Times New Roman 14 pt on both (LR 5.1(C); 32.2 pt double pitch, 16.1 pt single lines for headings, caption, quotations, footnotes and signature); make-reference.sh and reference.docx give way to docx/reference.xml (base="xengine", {font}); gand-motion-brief.lua writes the cover, caption rows, headings, block quotations, signature, LR 7.1(D) font certificate and certificate of service with xe spacing, body paragraphs as pandoc Body Text with Word footnotes (the 20-line footnote now sits whole on p3 in both engines: typst footnote entries at leading 0). XENG-001..003 pass (226/226 lines), params.cross_engine: gate; typst 9 and docx 13 passed, 0 failed (fb-595.68.12)
</commit_message>
<xml_diff>
--- a/courts/eleventh-circuit/georgia/federal/northern-district/motion-brief/usage/OUTPUT-motion-brief.docx
+++ b/courts/eleventh-circuit/georgia/federal/northern-district/motion-brief/usage/OUTPUT-motion-brief.docx
@@ -4,45 +4,57 @@
   <w:body>
     <w:p>
       <w:pPr>
-        <w:pStyle w:val="GANDCourtTitle"/>
-      </w:pPr>
-      <w:r>
+        <w:spacing w:before="0" w:after="0" w:line="322" w:lineRule="exact"/>
+        <w:ind w:left="0" w:firstLine="0"/>
+        <w:jc w:val="center"/>
+      </w:pPr>
+      <w:r>
+        <w:rPr>
+          <w:b/>
+          <w:bCs/>
+        </w:rPr>
         <w:t xml:space="preserve">IN THE UNITED STATES DISTRICT COURT</w:t>
       </w:r>
     </w:p>
     <w:p>
       <w:pPr>
-        <w:pStyle w:val="GANDCourtTitle"/>
-      </w:pPr>
-      <w:r>
+        <w:spacing w:before="0" w:after="0" w:line="322" w:lineRule="exact"/>
+        <w:ind w:left="0" w:firstLine="0"/>
+        <w:jc w:val="center"/>
+      </w:pPr>
+      <w:r>
+        <w:rPr>
+          <w:b/>
+          <w:bCs/>
+        </w:rPr>
         <w:t xml:space="preserve">FOR THE NORTHERN DISTRICT OF GEORGIA</w:t>
       </w:r>
     </w:p>
     <w:p>
       <w:pPr>
-        <w:pStyle w:val="GANDCourtTitleLast"/>
-      </w:pPr>
-      <w:r>
+        <w:spacing w:before="0" w:after="322" w:line="322" w:lineRule="exact"/>
+        <w:ind w:left="0" w:firstLine="0"/>
+        <w:jc w:val="center"/>
+      </w:pPr>
+      <w:r>
+        <w:rPr>
+          <w:b/>
+          <w:bCs/>
+        </w:rPr>
         <w:t xml:space="preserve">ATLANTA DIVISION</w:t>
       </w:r>
     </w:p>
     <w:tbl>
       <w:tblPr>
         <w:tblW w:w="9360" w:type="dxa"/>
-        <w:tblBorders>
-          <w:top w:val="nil"/>
-          <w:left w:val="nil"/>
-          <w:bottom w:val="nil"/>
-          <w:right w:val="nil"/>
-          <w:insideH w:val="nil"/>
-          <w:insideV w:val="nil"/>
-        </w:tblBorders>
         <w:tblLayout w:type="fixed"/>
         <w:tblCellMar>
+          <w:top w:w="0" w:type="dxa"/>
           <w:left w:w="0" w:type="dxa"/>
+          <w:bottom w:w="0" w:type="dxa"/>
           <w:right w:w="0" w:type="dxa"/>
         </w:tblCellMar>
-        <w:tblLook w:val="0000"/>
+        <w:tblLook w:val="0000" w:firstRow="0" w:lastRow="0" w:firstColumn="0" w:lastColumn="0" w:noHBand="0" w:noVBand="0"/>
       </w:tblPr>
       <w:tblGrid>
         <w:gridCol w:w="4608"/>
@@ -51,7 +63,7 @@
       </w:tblGrid>
       <w:tr>
         <w:trPr>
-          <w:trHeight w:val="392" w:hRule="exact"/>
+          <w:trHeight w:val="322" w:hRule="exact"/>
         </w:trPr>
         <w:tc>
           <w:tcPr>
@@ -59,10 +71,18 @@
           </w:tcPr>
           <w:p>
             <w:pPr>
-              <w:pStyle w:val="GANDCaption"/>
+              <w:spacing w:before="0" w:after="0" w:line="322" w:lineRule="exact"/>
+              <w:ind w:left="0" w:firstLine="0"/>
+              <w:jc w:val="left"/>
             </w:pPr>
             <w:r>
-              <w:t xml:space="preserve">PATTY DURAND,</w:t>
+              <w:t xml:space="preserve">PATTY</w:t>
+            </w:r>
+            <w:r>
+              <w:t xml:space="preserve"> </w:t>
+            </w:r>
+            <w:r>
+              <w:t xml:space="preserve">DURAND,</w:t>
             </w:r>
           </w:p>
         </w:tc>
@@ -72,7 +92,9 @@
           </w:tcPr>
           <w:p>
             <w:pPr>
-              <w:pStyle w:val="GANDCaption"/>
+              <w:spacing w:before="0" w:after="0" w:line="322" w:lineRule="exact"/>
+              <w:ind w:left="0" w:firstLine="0"/>
+              <w:jc w:val="left"/>
             </w:pPr>
             <w:r>
               <w:t xml:space="preserve">)</w:t>
@@ -82,22 +104,19 @@
         <w:tc>
           <w:tcPr>
             <w:tcW w:w="4248" w:type="dxa"/>
-            <w:vMerge w:val="restart"/>
-            <w:vAlign w:val="center"/>
           </w:tcPr>
           <w:p>
             <w:pPr>
-              <w:pStyle w:val="GANDCaption"/>
+              <w:spacing w:before="0" w:after="0" w:line="322" w:lineRule="exact"/>
+              <w:ind w:left="0" w:firstLine="0"/>
+              <w:jc w:val="left"/>
             </w:pPr>
-            <w:r>
-              <w:t xml:space="preserve">Civil Action No. 1:26-cv-03458-SDG</w:t>
-            </w:r>
           </w:p>
         </w:tc>
       </w:tr>
       <w:tr>
         <w:trPr>
-          <w:trHeight w:val="392" w:hRule="exact"/>
+          <w:trHeight w:val="322" w:hRule="exact"/>
         </w:trPr>
         <w:tc>
           <w:tcPr>
@@ -105,8 +124,9 @@
           </w:tcPr>
           <w:p>
             <w:pPr>
-              <w:pStyle w:val="GANDCaption"/>
-              <w:ind w:left="2160"/>
+              <w:spacing w:before="0" w:after="0" w:line="322" w:lineRule="exact"/>
+              <w:ind w:left="2160" w:firstLine="0"/>
+              <w:jc w:val="left"/>
             </w:pPr>
             <w:r>
               <w:t xml:space="preserve">Plaintiff,</w:t>
@@ -119,7 +139,9 @@
           </w:tcPr>
           <w:p>
             <w:pPr>
-              <w:pStyle w:val="GANDCaption"/>
+              <w:spacing w:before="0" w:after="0" w:line="322" w:lineRule="exact"/>
+              <w:ind w:left="0" w:firstLine="0"/>
+              <w:jc w:val="left"/>
             </w:pPr>
             <w:r>
               <w:t xml:space="preserve">)</w:t>
@@ -129,18 +151,19 @@
         <w:tc>
           <w:tcPr>
             <w:tcW w:w="4248" w:type="dxa"/>
-            <w:vMerge/>
           </w:tcPr>
           <w:p>
             <w:pPr>
-              <w:pStyle w:val="GANDCaption"/>
+              <w:spacing w:before="0" w:after="0" w:line="322" w:lineRule="exact"/>
+              <w:ind w:left="0" w:firstLine="0"/>
+              <w:jc w:val="left"/>
             </w:pPr>
           </w:p>
         </w:tc>
       </w:tr>
       <w:tr>
         <w:trPr>
-          <w:trHeight w:val="392" w:hRule="exact"/>
+          <w:trHeight w:val="322" w:hRule="exact"/>
         </w:trPr>
         <w:tc>
           <w:tcPr>
@@ -148,7 +171,9 @@
           </w:tcPr>
           <w:p>
             <w:pPr>
-              <w:pStyle w:val="GANDCaption"/>
+              <w:spacing w:before="0" w:after="0" w:line="322" w:lineRule="exact"/>
+              <w:ind w:left="0" w:firstLine="0"/>
+              <w:jc w:val="left"/>
             </w:pPr>
             <w:r>
               <w:t xml:space="preserve">v.</w:t>
@@ -161,7 +186,9 @@
           </w:tcPr>
           <w:p>
             <w:pPr>
-              <w:pStyle w:val="GANDCaption"/>
+              <w:spacing w:before="0" w:after="0" w:line="322" w:lineRule="exact"/>
+              <w:ind w:left="0" w:firstLine="0"/>
+              <w:jc w:val="left"/>
             </w:pPr>
             <w:r>
               <w:t xml:space="preserve">)</w:t>
@@ -171,18 +198,19 @@
         <w:tc>
           <w:tcPr>
             <w:tcW w:w="4248" w:type="dxa"/>
-            <w:vMerge/>
           </w:tcPr>
           <w:p>
             <w:pPr>
-              <w:pStyle w:val="GANDCaption"/>
+              <w:spacing w:before="0" w:after="0" w:line="322" w:lineRule="exact"/>
+              <w:ind w:left="0" w:firstLine="0"/>
+              <w:jc w:val="left"/>
             </w:pPr>
           </w:p>
         </w:tc>
       </w:tr>
       <w:tr>
         <w:trPr>
-          <w:trHeight w:val="392" w:hRule="exact"/>
+          <w:trHeight w:val="322" w:hRule="exact"/>
         </w:trPr>
         <w:tc>
           <w:tcPr>
@@ -190,10 +218,30 @@
           </w:tcPr>
           <w:p>
             <w:pPr>
-              <w:pStyle w:val="GANDCaption"/>
+              <w:spacing w:before="0" w:after="0" w:line="322" w:lineRule="exact"/>
+              <w:ind w:left="0" w:firstLine="0"/>
+              <w:jc w:val="left"/>
             </w:pPr>
             <w:r>
-              <w:t xml:space="preserve">JASON HAYES, individually and</w:t>
+              <w:t xml:space="preserve">JASON</w:t>
+            </w:r>
+            <w:r>
+              <w:t xml:space="preserve"> </w:t>
+            </w:r>
+            <w:r>
+              <w:t xml:space="preserve">HAYES,</w:t>
+            </w:r>
+            <w:r>
+              <w:t xml:space="preserve"> </w:t>
+            </w:r>
+            <w:r>
+              <w:t xml:space="preserve">individually</w:t>
+            </w:r>
+            <w:r>
+              <w:t xml:space="preserve"> </w:t>
+            </w:r>
+            <w:r>
+              <w:t xml:space="preserve">and</w:t>
             </w:r>
           </w:p>
         </w:tc>
@@ -203,7 +251,9 @@
           </w:tcPr>
           <w:p>
             <w:pPr>
-              <w:pStyle w:val="GANDCaption"/>
+              <w:spacing w:before="0" w:after="0" w:line="322" w:lineRule="exact"/>
+              <w:ind w:left="0" w:firstLine="0"/>
+              <w:jc w:val="left"/>
             </w:pPr>
             <w:r>
               <w:t xml:space="preserve">)</w:t>
@@ -213,18 +263,24 @@
         <w:tc>
           <w:tcPr>
             <w:tcW w:w="4248" w:type="dxa"/>
-            <w:vMerge/>
           </w:tcPr>
           <w:p>
             <w:pPr>
-              <w:pStyle w:val="GANDCaption"/>
+              <w:spacing w:before="0" w:after="0" w:line="322" w:lineRule="exact"/>
+              <w:ind w:left="0" w:firstLine="0"/>
+              <w:jc w:val="left"/>
             </w:pPr>
+            <w:r>
+              <w:t xml:space="preserve">Civil Action No. 1:26-cv</w:t>
+              <w:noBreakHyphen/>
+              <w:t xml:space="preserve">03458-SDG</w:t>
+            </w:r>
           </w:p>
         </w:tc>
       </w:tr>
       <w:tr>
         <w:trPr>
-          <w:trHeight w:val="392" w:hRule="exact"/>
+          <w:trHeight w:val="322" w:hRule="exact"/>
         </w:trPr>
         <w:tc>
           <w:tcPr>
@@ -232,10 +288,42 @@
           </w:tcPr>
           <w:p>
             <w:pPr>
-              <w:pStyle w:val="GANDCaption"/>
+              <w:spacing w:before="0" w:after="0" w:line="322" w:lineRule="exact"/>
+              <w:ind w:left="0" w:firstLine="0"/>
+              <w:jc w:val="left"/>
             </w:pPr>
             <w:r>
-              <w:t xml:space="preserve">in his official capacity as the</w:t>
+              <w:t xml:space="preserve">in</w:t>
+            </w:r>
+            <w:r>
+              <w:t xml:space="preserve"> </w:t>
+            </w:r>
+            <w:r>
+              <w:t xml:space="preserve">his</w:t>
+            </w:r>
+            <w:r>
+              <w:t xml:space="preserve"> </w:t>
+            </w:r>
+            <w:r>
+              <w:t xml:space="preserve">official</w:t>
+            </w:r>
+            <w:r>
+              <w:t xml:space="preserve"> </w:t>
+            </w:r>
+            <w:r>
+              <w:t xml:space="preserve">capacity</w:t>
+            </w:r>
+            <w:r>
+              <w:t xml:space="preserve"> </w:t>
+            </w:r>
+            <w:r>
+              <w:t xml:space="preserve">as</w:t>
+            </w:r>
+            <w:r>
+              <w:t xml:space="preserve"> </w:t>
+            </w:r>
+            <w:r>
+              <w:t xml:space="preserve">the</w:t>
             </w:r>
           </w:p>
         </w:tc>
@@ -245,7 +333,9 @@
           </w:tcPr>
           <w:p>
             <w:pPr>
-              <w:pStyle w:val="GANDCaption"/>
+              <w:spacing w:before="0" w:after="0" w:line="322" w:lineRule="exact"/>
+              <w:ind w:left="0" w:firstLine="0"/>
+              <w:jc w:val="left"/>
             </w:pPr>
             <w:r>
               <w:t xml:space="preserve">)</w:t>
@@ -255,18 +345,19 @@
         <w:tc>
           <w:tcPr>
             <w:tcW w:w="4248" w:type="dxa"/>
-            <w:vMerge/>
           </w:tcPr>
           <w:p>
             <w:pPr>
-              <w:pStyle w:val="GANDCaption"/>
+              <w:spacing w:before="0" w:after="0" w:line="322" w:lineRule="exact"/>
+              <w:ind w:left="0" w:firstLine="0"/>
+              <w:jc w:val="left"/>
             </w:pPr>
           </w:p>
         </w:tc>
       </w:tr>
       <w:tr>
         <w:trPr>
-          <w:trHeight w:val="392" w:hRule="exact"/>
+          <w:trHeight w:val="322" w:hRule="exact"/>
         </w:trPr>
         <w:tc>
           <w:tcPr>
@@ -274,10 +365,36 @@
           </w:tcPr>
           <w:p>
             <w:pPr>
-              <w:pStyle w:val="GANDCaption"/>
+              <w:spacing w:before="0" w:after="0" w:line="322" w:lineRule="exact"/>
+              <w:ind w:left="0" w:firstLine="0"/>
+              <w:jc w:val="left"/>
             </w:pPr>
             <w:r>
-              <w:t xml:space="preserve">Lieutenant of the Georgia State</w:t>
+              <w:t xml:space="preserve">Lieutenant</w:t>
+            </w:r>
+            <w:r>
+              <w:t xml:space="preserve"> </w:t>
+            </w:r>
+            <w:r>
+              <w:t xml:space="preserve">of</w:t>
+            </w:r>
+            <w:r>
+              <w:t xml:space="preserve"> </w:t>
+            </w:r>
+            <w:r>
+              <w:t xml:space="preserve">the</w:t>
+            </w:r>
+            <w:r>
+              <w:t xml:space="preserve"> </w:t>
+            </w:r>
+            <w:r>
+              <w:t xml:space="preserve">Georgia</w:t>
+            </w:r>
+            <w:r>
+              <w:t xml:space="preserve"> </w:t>
+            </w:r>
+            <w:r>
+              <w:t xml:space="preserve">State</w:t>
             </w:r>
           </w:p>
         </w:tc>
@@ -287,7 +404,9 @@
           </w:tcPr>
           <w:p>
             <w:pPr>
-              <w:pStyle w:val="GANDCaption"/>
+              <w:spacing w:before="0" w:after="0" w:line="322" w:lineRule="exact"/>
+              <w:ind w:left="0" w:firstLine="0"/>
+              <w:jc w:val="left"/>
             </w:pPr>
             <w:r>
               <w:t xml:space="preserve">)</w:t>
@@ -297,18 +416,19 @@
         <w:tc>
           <w:tcPr>
             <w:tcW w:w="4248" w:type="dxa"/>
-            <w:vMerge/>
           </w:tcPr>
           <w:p>
             <w:pPr>
-              <w:pStyle w:val="GANDCaption"/>
+              <w:spacing w:before="0" w:after="0" w:line="322" w:lineRule="exact"/>
+              <w:ind w:left="0" w:firstLine="0"/>
+              <w:jc w:val="left"/>
             </w:pPr>
           </w:p>
         </w:tc>
       </w:tr>
       <w:tr>
         <w:trPr>
-          <w:trHeight w:val="392" w:hRule="exact"/>
+          <w:trHeight w:val="322" w:hRule="exact"/>
         </w:trPr>
         <w:tc>
           <w:tcPr>
@@ -316,10 +436,18 @@
           </w:tcPr>
           <w:p>
             <w:pPr>
-              <w:pStyle w:val="GANDCaption"/>
+              <w:spacing w:before="0" w:after="0" w:line="322" w:lineRule="exact"/>
+              <w:ind w:left="0" w:firstLine="0"/>
+              <w:jc w:val="left"/>
             </w:pPr>
             <w:r>
-              <w:t xml:space="preserve">Capitol Police,</w:t>
+              <w:t xml:space="preserve">Capitol</w:t>
+            </w:r>
+            <w:r>
+              <w:t xml:space="preserve"> </w:t>
+            </w:r>
+            <w:r>
+              <w:t xml:space="preserve">Police,</w:t>
             </w:r>
           </w:p>
         </w:tc>
@@ -329,7 +457,9 @@
           </w:tcPr>
           <w:p>
             <w:pPr>
-              <w:pStyle w:val="GANDCaption"/>
+              <w:spacing w:before="0" w:after="0" w:line="322" w:lineRule="exact"/>
+              <w:ind w:left="0" w:firstLine="0"/>
+              <w:jc w:val="left"/>
             </w:pPr>
             <w:r>
               <w:t xml:space="preserve">)</w:t>
@@ -339,18 +469,19 @@
         <w:tc>
           <w:tcPr>
             <w:tcW w:w="4248" w:type="dxa"/>
-            <w:vMerge/>
           </w:tcPr>
           <w:p>
             <w:pPr>
-              <w:pStyle w:val="GANDCaption"/>
+              <w:spacing w:before="0" w:after="0" w:line="322" w:lineRule="exact"/>
+              <w:ind w:left="0" w:firstLine="0"/>
+              <w:jc w:val="left"/>
             </w:pPr>
           </w:p>
         </w:tc>
       </w:tr>
       <w:tr>
         <w:trPr>
-          <w:trHeight w:val="392" w:hRule="exact"/>
+          <w:trHeight w:val="322" w:hRule="exact"/>
         </w:trPr>
         <w:tc>
           <w:tcPr>
@@ -358,8 +489,9 @@
           </w:tcPr>
           <w:p>
             <w:pPr>
-              <w:pStyle w:val="GANDCaption"/>
-              <w:ind w:left="2160"/>
+              <w:spacing w:before="0" w:after="0" w:line="322" w:lineRule="exact"/>
+              <w:ind w:left="2160" w:firstLine="0"/>
+              <w:jc w:val="left"/>
             </w:pPr>
             <w:r>
               <w:t xml:space="preserve">Defendant.</w:t>
@@ -372,7 +504,9 @@
           </w:tcPr>
           <w:p>
             <w:pPr>
-              <w:pStyle w:val="GANDCaption"/>
+              <w:spacing w:before="0" w:after="0" w:line="322" w:lineRule="exact"/>
+              <w:ind w:left="0" w:firstLine="0"/>
+              <w:jc w:val="left"/>
             </w:pPr>
             <w:r>
               <w:t xml:space="preserve">)</w:t>
@@ -382,11 +516,12 @@
         <w:tc>
           <w:tcPr>
             <w:tcW w:w="4248" w:type="dxa"/>
-            <w:vMerge/>
           </w:tcPr>
           <w:p>
             <w:pPr>
-              <w:pStyle w:val="GANDCaption"/>
+              <w:spacing w:before="0" w:after="0" w:line="322" w:lineRule="exact"/>
+              <w:ind w:left="0" w:firstLine="0"/>
+              <w:jc w:val="left"/>
             </w:pPr>
           </w:p>
         </w:tc>
@@ -394,15 +529,21 @@
     </w:tbl>
     <w:p>
       <w:pPr>
-        <w:pStyle w:val="GANDCoverTitle"/>
-      </w:pPr>
-      <w:r>
-        <w:t xml:space="preserve">Motion to Dismiss with Supporting Memorandum of Law</w:t>
-      </w:r>
-    </w:p>
-    <w:p>
-      <w:pPr>
-        <w:pStyle w:val="FirstParagraph"/>
+        <w:spacing w:before="322" w:after="322" w:line="322" w:lineRule="exact"/>
+        <w:ind w:left="0" w:firstLine="0"/>
+        <w:jc w:val="center"/>
+      </w:pPr>
+      <w:r>
+        <w:rPr>
+          <w:b/>
+          <w:bCs/>
+        </w:rPr>
+        <w:t xml:space="preserve">MOTION TO DISMISS WITH SUPPORTING MEMORANDUM OF LAW</w:t>
+      </w:r>
+    </w:p>
+    <w:p>
+      <w:pPr>
+        <w:pStyle w:val="BodyText"/>
       </w:pPr>
       <w:r>
         <w:t xml:space="preserve">Defendant Jason Hayes, through counsel, hereby moves to dismiss the claims asserted against him in this action.</w:t>
@@ -411,51 +552,79 @@
     <w:p>
       <w:pPr>
         <w:pStyle w:val="Heading1"/>
-      </w:pPr>
-      <w:bookmarkStart w:id="9" w:name="_introduction"/>
-      <w:r>
+        <w:keepNext/>
+        <w:keepLines/>
+        <w:spacing w:before="322" w:after="322" w:line="322" w:lineRule="exact"/>
+        <w:ind w:left="0" w:firstLine="0"/>
+        <w:jc w:val="center"/>
+      </w:pPr>
+      <w:r>
+        <w:rPr>
+          <w:b/>
+          <w:bCs/>
+        </w:rPr>
         <w:t xml:space="preserve">INTRODUCTION</w:t>
       </w:r>
-      <w:bookmarkEnd w:id="9"/>
-    </w:p>
-    <w:p>
-      <w:pPr>
-        <w:pStyle w:val="FirstParagraph"/>
-      </w:pPr>
-      <w:r>
-        <w:t xml:space="preserve">This is an unusual case. Plaintiff Patty Durand brings First Amendment and Georgia Open Meetings Act claims that are premised on a contention that restrictions imposed upon her by Georgia’s Capitol Police keep her from engaging in expressive activity at Georgia’s State Capitol and in the 244 Washington building where the state’s Public Service Commission meetings are held. But the challenged restrictions are based on her own unlawful conduct in the latter forum. She unquestionably committed an act of theft in the 244 Washington building. She took property (a booklet prominently labelled trade secrets) of another presenter at a PSC meeting and removed it from the meeting room. Georgia’s Capitol Police acted in response to that unlawful act – for which the complaint offers no explanation and for which there is no explanation that could be rooted in the First Amendment – by (i) prohibiting her access to the 244 Washington building so that others (including presenters at PSC meetings) can use it for its intended purpose, and (ii) requiring that she have a police escort for entry onto any other Capitol Hill property. For Ms. Durand to cry foul under the First Amendment now is the height of irony: she used the forum in issue for an unlawful purpose, not for expressive activity. For the Court to enter the relief that she seeks it essentially would need to determine that it knows better than the Georgia law enforcement body that is entrusted by state law to maintain order and security in Georgia’s State Capitol and the surrounding state office buildings. The Court should decline Ms. Durand’s invitation to venture into that important security arena.</w:t>
-      </w:r>
     </w:p>
     <w:p>
       <w:pPr>
         <w:pStyle w:val="BodyText"/>
       </w:pPr>
       <w:r>
-        <w:t xml:space="preserve">As shown herein, Ms. Durand pleads First Amendment interests and violations, but her conduct belies the plea and her complaint states no First Amendment claim. Likewise, the state law Open Meetings Act claim fails because jurisdiction to enforce the Act is given to Georgia’s Superior Courts, Lieutenant Hayes is not a proper defendant or respondent for a claim under the Act, and state law separately gives Georgia’s Capitol Police the authority to impose the restriction in issue and the Act does not by its terms restrict that authority. Finally, qualified immunity bars Ms. Durand’s federal claim for money damages because there is no case law that clearly establishes that the restriction in issue is unlawful.</w:t>
+        <w:t xml:space="preserve">This is an unusual case. Plaintiff Patty Durand brings First Amendment and Georgia Open Meetings Act claims that are premised on a contention that restrictions imposed upon her by Georgia’s Capitol Police keep her from engaging in expressive activity at Georgia’s State Capitol and in the 244 Washington building where the state’s Public Service Commission meetings are held. But the challenged restrictions are based on her own unlawful conduct in the latter forum. She unquestionably committed an act of theft in the 244 Washington building. She took property (a booklet prominently labelled trade secrets) of another presenter at a PSC meeting and removed it from the meeting room. Georgia’s Capitol Police acted in response to that unlawful act – for which the complaint offers no explanation and for which there is no explanation that could be rooted in the First Amendment – by (i) prohibiting her access to the 244 Washington building so that others (including presenters at PSC meetings) can use it for its intended purpose, and (ii) requiring that she have a police escort for entry onto any other Capitol Hill property. For Ms. Durand to cry foul under the First Amendment now is the height of irony: she used the forum in issue for an unlawful purpose, not for expressive activity. For the Court to enter the relief that she seeks it essentially would need to determine that it knows better than the Georgia law enforcement body that is entrusted by state law to maintain order and security in Georgia’s State Capitol and the surrounding state office buildings. The Court should decline Ms. Durand’s invitation to venture into that important security arena.</w:t>
+      </w:r>
+    </w:p>
+    <w:p>
+      <w:pPr>
+        <w:pStyle w:val="BodyText"/>
+      </w:pPr>
+      <w:r>
+        <w:t xml:space="preserve">As shown herein, Ms. Durand pleads First Amendment interests and violations, but her conduct belies the plea and her complaint states no First Amendment claim. Likewise, the state law Open Meetings Act claim fails because jurisdiction to enforce the Act is given to Georgia’s Superior Courts, Lieutenant Hayes is not a proper defendant or respondent for a claim under the Act, and state law separately gives Georgia’s Capitol Police the authority to impose the restriction in issue and the Act does not by its terms restrict that authority. Finally, qualified immunity bars Ms. Durand’s federal claim for money damages because there is no case law that clearly establishes that the restriction in issue is unlawful.</w:t>
       </w:r>
     </w:p>
     <w:p>
       <w:pPr>
         <w:pStyle w:val="Heading1"/>
-      </w:pPr>
-      <w:bookmarkStart w:id="10" w:name="_ca55e856ed72e3c3e5f5ab613cd026883560703"/>
-      <w:r>
-        <w:t xml:space="preserve">FACTUAL BACKROUND</w:t>
-      </w:r>
-      <w:bookmarkEnd w:id="10"/>
-    </w:p>
-    <w:p>
-      <w:pPr>
-        <w:pStyle w:val="FirstParagraph"/>
-      </w:pPr>
-      <w:r>
-        <w:t xml:space="preserve">Ms. Durand describes herself as “an active participant in the state government of Georgia [who] regularly attends meetings and hearings of the Georgia Public Service Commission and is actively engaged in legislative work at the Georgia General Assembly.” Doc. 1, ¶ 1. Defendant Hayes is a Lieutenant with the Georgia Capitol Police, a division of the Georgia Department of Public Safety (Georgia DPS). Id., ¶ 7.</w:t>
+        <w:keepNext/>
+        <w:keepLines/>
+        <w:spacing w:before="322" w:after="322" w:line="322" w:lineRule="exact"/>
+        <w:ind w:left="0" w:firstLine="0"/>
+        <w:jc w:val="center"/>
+      </w:pPr>
+      <w:r>
+        <w:rPr>
+          <w:b/>
+          <w:bCs/>
+        </w:rPr>
+        <w:t xml:space="preserve">FACTUAL</w:t>
+      </w:r>
+      <w:r>
+        <w:rPr>
+          <w:b/>
+          <w:bCs/>
+        </w:rPr>
+        <w:t xml:space="preserve"> </w:t>
+      </w:r>
+      <w:r>
+        <w:rPr>
+          <w:b/>
+          <w:bCs/>
+        </w:rPr>
+        <w:t xml:space="preserve">BACKROUND</w:t>
+      </w:r>
+    </w:p>
+    <w:p>
+      <w:pPr>
+        <w:pStyle w:val="BodyText"/>
+      </w:pPr>
+      <w:r>
+        <w:t xml:space="preserve">Ms. Durand describes herself as “an active participant in the state government of Georgia [who] regularly attends meetings and hearings of the Georgia Public Service Commission and is actively engaged in legislative work at the Georgia General Assembly.” Doc. 1, ¶ 1. Defendant Hayes is a Lieutenant with the Georgia Capitol Police, a division of the Georgia Department of Public Safety (Georgia DPS). Id., ¶ 7.</w:t>
       </w:r>
       <w:r>
         <w:rPr>
           <w:rStyle w:val="FootnoteReference"/>
         </w:rPr>
-        <w:footnoteReference w:id="11"/>
+        <w:footnoteReference w:id="9"/>
       </w:r>
     </w:p>
     <w:p>
@@ -463,7 +632,25 @@
         <w:pStyle w:val="BodyText"/>
       </w:pPr>
       <w:r>
-        <w:t xml:space="preserve">On October 21, 2025, Ms. Durand attended a PSC meeting in the 244 Washington building. Doc. 1, ¶¶ 2, 19, 20; see also Doc. 1-2; Doc. 1-3. The complaint describes the meeting as “an energy regulatory hearing,” and the attachments to the pleading show that the Georgia Power Company was a presenter at the hearing. See id. On a lunch break during the hearing, Ms. Durand stole a booklet from the PSC meeting room. See id. Her bold theft was caught on camera. See id.; and see Docs. 11, 12, Docket foll. 13. The booklet she stole bore this label: Georgia Power Trade Secrets 2029-2031 All-source RDP. See id. In other words, it was plain from the cover of the booklet that what she stole was property belonging to Georgia Power and that it contained trade secrets.</w:t>
+        <w:t xml:space="preserve">On October 21, 2025, Ms. Durand attended a PSC meeting in the 244 Washington building. Doc. 1, ¶¶ 2, 19, 20; see also Doc. 1</w:t>
+      </w:r>
+      <w:r>
+        <w:noBreakHyphen/>
+      </w:r>
+      <w:r>
+        <w:t xml:space="preserve">2; Doc. 1</w:t>
+      </w:r>
+      <w:r>
+        <w:noBreakHyphen/>
+      </w:r>
+      <w:r>
+        <w:t xml:space="preserve">3. The complaint describes the meeting as “an energy regulatory hearing,” and the attachments to the pleading show that the Georgia Power Company was a presenter at the hearing. See id. On a lunch break during the hearing, Ms. Durand stole a booklet from the PSC meeting room. See id. Her bold theft was caught on camera. See id.; and see Docs. 11, 12, Docket foll. 13. The booklet she stole bore this label: Georgia Power Trade Secrets 2029</w:t>
+      </w:r>
+      <w:r>
+        <w:noBreakHyphen/>
+      </w:r>
+      <w:r>
+        <w:t xml:space="preserve">2031 All-source RDP. See id. In other words, it was plain from the cover of the booklet that what she stole was property belonging to Georgia Power and that it contained trade secrets.</w:t>
       </w:r>
     </w:p>
     <w:p>
@@ -471,7 +658,25 @@
         <w:pStyle w:val="BodyText"/>
       </w:pPr>
       <w:r>
-        <w:t xml:space="preserve">As a result of her conduct, Ms. Durand is no longer permitted to enter the 244 Washington building where PSC meetings are held. Doc. 1, ¶¶ 30-35; and see also Doc. 11-1 at 20 (BOLO). She is permitted to enter other Capitol Hill properties, including the State Capitol, but she must do so under Capitol Police escort. Id. The Capitol Police Division imposed these restrictions after, and because of, her conduct in the 244 Washington building. Doc. 1-4 at 5.</w:t>
+        <w:t xml:space="preserve">As a result of her conduct, Ms. Durand is no longer permitted to enter the 244 Washington building where PSC meetings are held. Doc. 1, ¶¶ 30</w:t>
+      </w:r>
+      <w:r>
+        <w:noBreakHyphen/>
+      </w:r>
+      <w:r>
+        <w:t xml:space="preserve">35; and see also Doc. 11</w:t>
+      </w:r>
+      <w:r>
+        <w:noBreakHyphen/>
+      </w:r>
+      <w:r>
+        <w:t xml:space="preserve">1 at 20 (BOLO). She is permitted to enter other Capitol Hill properties, including the State Capitol, but she must do so under Capitol Police escort. Id. The Capitol Police Division imposed these restrictions after, and because of, her conduct in the 244 Washington building. Doc. 1</w:t>
+      </w:r>
+      <w:r>
+        <w:noBreakHyphen/>
+      </w:r>
+      <w:r>
+        <w:t xml:space="preserve">4 at 5.</w:t>
       </w:r>
     </w:p>
     <w:p>
@@ -479,7 +684,7 @@
         <w:pStyle w:val="BodyText"/>
       </w:pPr>
       <w:r>
-        <w:t xml:space="preserve">The complaint pleads that, after the imposition of these restrictions, Ms. Durand entered the State Capitol and met with a state senator on one occasion and she was subjected to the escort requirement, and that the escort caused her “embarrassment, discomfort, and unease.” Doc. 1, ¶¶ 30, 54. She asserts that, “[d]ue to the embarrassment, discomfort, and unease imposed by this special escort condition, [she] has refrained from attending at least four events” at the State Capitol. See id., ¶ 55. She does not plead that the escort requirement prohibits her from entering the State Capitol, or from meeting with others there, or from speaking, assembling or otherwise engaging in expressive activities there.</w:t>
+        <w:t xml:space="preserve">The complaint pleads that, after the imposition of these restrictions, Ms. Durand entered the State Capitol and met with a state senator on one occasion and she was subjected to the escort requirement, and that the escort caused her “embarrassment, discomfort, and unease.” Doc. 1, ¶¶ 30, 54. She asserts that, “[d]ue to the embarrassment, discomfort, and unease imposed by this special escort condition, [she] has refrained from attending at least four events” at the State Capitol. See id., ¶ 55. She does not plead that the escort requirement prohibits her from entering the State Capitol, or from meeting with others there, or from speaking, assembling or otherwise engaging in expressive activities there.</w:t>
       </w:r>
     </w:p>
     <w:p>
@@ -487,35 +692,191 @@
         <w:pStyle w:val="BodyText"/>
       </w:pPr>
       <w:r>
-        <w:t xml:space="preserve">The complaint includes two counts. Count One is a free speech claim under 42 U.S.C. § 1983 and the First Amendment. Doc. 1 at 13-15. Count Two is a claim under Georgia’s Open Meetings Act, O.C.G.A. §§ 50-14-1, et seq. Id. at 15-16. As relief the complaint seeks “declaratory as well as preliminary and permanent injunctive relief . . . lifting the criminal trespass ban as applied.” Id. at 16. It also seeks “nominal, presumed, compensatory, and other damages,” “civil penalties under the Georgia Open Meetings Act,” and attorneys’ fees, expenses and costs under 42 U.S.C. § 1988 and state law. Id.</w:t>
+        <w:t xml:space="preserve">The complaint includes two counts. Count One is a free speech claim under 42 U.S.C. § 1983 and the First Amendment. Doc. 1 at 13</w:t>
+      </w:r>
+      <w:r>
+        <w:noBreakHyphen/>
+      </w:r>
+      <w:r>
+        <w:t xml:space="preserve">15. Count Two is a claim under Georgia’s Open Meetings Act, O.C.G.A. §§ 50</w:t>
+      </w:r>
+      <w:r>
+        <w:noBreakHyphen/>
+      </w:r>
+      <w:r>
+        <w:t xml:space="preserve">14</w:t>
+      </w:r>
+      <w:r>
+        <w:noBreakHyphen/>
+      </w:r>
+      <w:r>
+        <w:t xml:space="preserve">1, et seq. Id. at 15</w:t>
+      </w:r>
+      <w:r>
+        <w:noBreakHyphen/>
+      </w:r>
+      <w:r>
+        <w:t xml:space="preserve">16. As relief the complaint seeks “declaratory as well as preliminary and permanent injunctive relief . . . lifting the criminal trespass ban as applied.” Id. at 16. It also seeks “nominal, presumed, compensatory, and other damages,” “civil penalties under the Georgia Open Meetings Act,” and attorneys’ fees, expenses and costs under 42 U.S.C. § 1988 and state law. Id.</w:t>
       </w:r>
     </w:p>
     <w:p>
       <w:pPr>
         <w:pStyle w:val="Heading1"/>
-      </w:pPr>
-      <w:bookmarkStart w:id="12" w:name="_c336b12baf508029fbbdbba42add7d53087af16"/>
-      <w:r>
-        <w:t xml:space="preserve">ARGUMENT AND CITATION OF AUTHORITY</w:t>
-      </w:r>
-      <w:bookmarkEnd w:id="12"/>
+        <w:keepNext/>
+        <w:keepLines/>
+        <w:spacing w:before="322" w:after="322" w:line="322" w:lineRule="exact"/>
+        <w:ind w:left="0" w:firstLine="0"/>
+        <w:jc w:val="center"/>
+      </w:pPr>
+      <w:r>
+        <w:rPr>
+          <w:b/>
+          <w:bCs/>
+        </w:rPr>
+        <w:t xml:space="preserve">ARGUMENT</w:t>
+      </w:r>
+      <w:r>
+        <w:rPr>
+          <w:b/>
+          <w:bCs/>
+        </w:rPr>
+        <w:t xml:space="preserve"> </w:t>
+      </w:r>
+      <w:r>
+        <w:rPr>
+          <w:b/>
+          <w:bCs/>
+        </w:rPr>
+        <w:t xml:space="preserve">AND</w:t>
+      </w:r>
+      <w:r>
+        <w:rPr>
+          <w:b/>
+          <w:bCs/>
+        </w:rPr>
+        <w:t xml:space="preserve"> </w:t>
+      </w:r>
+      <w:r>
+        <w:rPr>
+          <w:b/>
+          <w:bCs/>
+        </w:rPr>
+        <w:t xml:space="preserve">CITATION</w:t>
+      </w:r>
+      <w:r>
+        <w:rPr>
+          <w:b/>
+          <w:bCs/>
+        </w:rPr>
+        <w:t xml:space="preserve"> </w:t>
+      </w:r>
+      <w:r>
+        <w:rPr>
+          <w:b/>
+          <w:bCs/>
+        </w:rPr>
+        <w:t xml:space="preserve">OF</w:t>
+      </w:r>
+      <w:r>
+        <w:rPr>
+          <w:b/>
+          <w:bCs/>
+        </w:rPr>
+        <w:t xml:space="preserve"> </w:t>
+      </w:r>
+      <w:r>
+        <w:rPr>
+          <w:b/>
+          <w:bCs/>
+        </w:rPr>
+        <w:t xml:space="preserve">AUTHORITY</w:t>
+      </w:r>
     </w:p>
     <w:p>
       <w:pPr>
         <w:pStyle w:val="Heading2"/>
-      </w:pPr>
-      <w:bookmarkStart w:id="13" w:name="_cebb226cd26386a158e7142c30d9641fea59155"/>
-      <w:r>
-        <w:t xml:space="preserve">A. Authority of the Capitol Police</w:t>
-      </w:r>
-      <w:bookmarkEnd w:id="13"/>
-    </w:p>
-    <w:p>
-      <w:pPr>
-        <w:pStyle w:val="FirstParagraph"/>
-      </w:pPr>
-      <w:r>
-        <w:t xml:space="preserve">The Capitol Police Division of Georgia DPS was created by state statute, and under the statute it has jurisdiction, and the primary duty, to enforce all laws in Capitol Square and the property and buildings owned by the Georgia Building Authority within a five-mile radius of Capitol Square. See O.C.G.A. §§ 35-2-120, 35-2-121, 35-2-122. As defined by the statute, Capitol Square includes “[t]he property owned by this state and the sidewalks and streets within the area in the City of Atlanta bounded by Washington Street, Trinity Avenue, Memorial Drive, Capitol Avenue, and Martin Luther King, Jr. Drive.” See id.</w:t>
+        <w:keepNext/>
+        <w:keepLines/>
+        <w:spacing w:before="322" w:after="322" w:line="322" w:lineRule="exact"/>
+        <w:ind w:left="0" w:firstLine="0"/>
+        <w:jc w:val="left"/>
+      </w:pPr>
+      <w:r>
+        <w:rPr>
+          <w:b/>
+          <w:bCs/>
+        </w:rPr>
+        <w:t xml:space="preserve">A.</w:t>
+      </w:r>
+      <w:r>
+        <w:rPr>
+          <w:b/>
+          <w:bCs/>
+        </w:rPr>
+        <w:t xml:space="preserve"> </w:t>
+      </w:r>
+      <w:r>
+        <w:rPr>
+          <w:b/>
+          <w:bCs/>
+        </w:rPr>
+        <w:t xml:space="preserve">Authority</w:t>
+      </w:r>
+      <w:r>
+        <w:rPr>
+          <w:b/>
+          <w:bCs/>
+        </w:rPr>
+        <w:t xml:space="preserve"> </w:t>
+      </w:r>
+      <w:r>
+        <w:rPr>
+          <w:b/>
+          <w:bCs/>
+        </w:rPr>
+        <w:t xml:space="preserve">of</w:t>
+      </w:r>
+      <w:r>
+        <w:rPr>
+          <w:b/>
+          <w:bCs/>
+        </w:rPr>
+        <w:t xml:space="preserve"> </w:t>
+      </w:r>
+      <w:r>
+        <w:rPr>
+          <w:b/>
+          <w:bCs/>
+        </w:rPr>
+        <w:t xml:space="preserve">the</w:t>
+      </w:r>
+      <w:r>
+        <w:rPr>
+          <w:b/>
+          <w:bCs/>
+        </w:rPr>
+        <w:t xml:space="preserve"> </w:t>
+      </w:r>
+      <w:r>
+        <w:rPr>
+          <w:b/>
+          <w:bCs/>
+        </w:rPr>
+        <w:t xml:space="preserve">Capitol</w:t>
+      </w:r>
+      <w:r>
+        <w:rPr>
+          <w:b/>
+          <w:bCs/>
+        </w:rPr>
+        <w:t xml:space="preserve"> </w:t>
+      </w:r>
+      <w:r>
+        <w:rPr>
+          <w:b/>
+          <w:bCs/>
+        </w:rPr>
+        <w:t xml:space="preserve">Police</w:t>
       </w:r>
     </w:p>
     <w:p>
@@ -523,25 +884,150 @@
         <w:pStyle w:val="BodyText"/>
       </w:pPr>
       <w:r>
-        <w:t xml:space="preserve">Georgia law expressly authorizes and empowers DPS officers (including the Capitol Police) to deny any person entrance into or upon, and to remove them from, any property or building of the Georgia Building Authority or the state, when the person’s activities are intended to disrupt or interfere with the normal activities and functions carried on in such property or building or have the potential of violating the security of the persons therein, and also when the person’s activities interfere with or disrupt the activities and the operations carried on in such property or building or constitute a safety hazard to the property or building or the inhabitants thereof. See O.C.G.A. § 50-16-14.</w:t>
+        <w:t xml:space="preserve">The Capitol Police Division of Georgia DPS was created by state statute, and under the statute it has jurisdiction, and the primary duty, to enforce all laws in Capitol Square and the property and buildings owned by the Georgia Building Authority within a five-mile radius of Capitol Square. See O.C.G.A. §§ 35</w:t>
+      </w:r>
+      <w:r>
+        <w:noBreakHyphen/>
+      </w:r>
+      <w:r>
+        <w:t xml:space="preserve">2</w:t>
+      </w:r>
+      <w:r>
+        <w:noBreakHyphen/>
+      </w:r>
+      <w:r>
+        <w:t xml:space="preserve">120, 35</w:t>
+      </w:r>
+      <w:r>
+        <w:noBreakHyphen/>
+      </w:r>
+      <w:r>
+        <w:t xml:space="preserve">2</w:t>
+      </w:r>
+      <w:r>
+        <w:noBreakHyphen/>
+      </w:r>
+      <w:r>
+        <w:t xml:space="preserve">121, 35</w:t>
+      </w:r>
+      <w:r>
+        <w:noBreakHyphen/>
+      </w:r>
+      <w:r>
+        <w:t xml:space="preserve">2</w:t>
+      </w:r>
+      <w:r>
+        <w:noBreakHyphen/>
+      </w:r>
+      <w:r>
+        <w:t xml:space="preserve">122. As defined by the statute, Capitol Square includes “[t]he property owned by this state and the sidewalks and streets within the area in the City of Atlanta bounded by Washington Street, Trinity Avenue, Memorial Drive, Capitol Avenue, and Martin Luther King, Jr. Drive.” See id.</w:t>
+      </w:r>
+    </w:p>
+    <w:p>
+      <w:pPr>
+        <w:pStyle w:val="BodyText"/>
+      </w:pPr>
+      <w:r>
+        <w:t xml:space="preserve">Georgia law expressly authorizes and empowers DPS officers (including the Capitol Police) to deny any person entrance into or upon, and to remove them from, any property or building of the Georgia Building Authority or the state, when the person’s activities are intended to disrupt or interfere with the normal activities and functions carried on in such property or building or have the potential of violating the security of the persons therein, and also when the person’s activities interfere with or disrupt the activities and the operations carried on in such property or building or constitute a safety hazard to the property or building or the inhabitants thereof. See O.C.G.A. § 50</w:t>
+      </w:r>
+      <w:r>
+        <w:noBreakHyphen/>
+      </w:r>
+      <w:r>
+        <w:t xml:space="preserve">16</w:t>
+      </w:r>
+      <w:r>
+        <w:noBreakHyphen/>
+      </w:r>
+      <w:r>
+        <w:t xml:space="preserve">14.</w:t>
       </w:r>
     </w:p>
     <w:p>
       <w:pPr>
         <w:pStyle w:val="Heading2"/>
-      </w:pPr>
-      <w:bookmarkStart w:id="14" w:name="_f13f25469f556cbad35a4b264ff562fdb054c87"/>
-      <w:r>
-        <w:t xml:space="preserve">B. Count One – First Amendment</w:t>
-      </w:r>
-      <w:bookmarkEnd w:id="14"/>
-    </w:p>
-    <w:p>
-      <w:pPr>
-        <w:pStyle w:val="FirstParagraph"/>
-      </w:pPr>
-      <w:r>
-        <w:t xml:space="preserve">The restriction in issue is a reasonable security response and precaution. It is based on Ms. Durand’s admitted (and video documented) unlawful conduct, not her speech or viewpoint. The complaint includes no plausible, non-conclusory fact allegation to the contrary. It pleads that Ms. Durand is politically active. Doc. 1, ¶¶ 1, 10-18. But it does not show that Lieutenant Hayes, or the Capitol Police, knew of her political or expressive activities and imposed the restriction because of them. The restriction is implemented and enforced by the Capitol Police Division, which is the arm of the Georgia DPS that is charged with maintaining public safety and security in and around the State Capitol.</w:t>
+        <w:keepNext/>
+        <w:keepLines/>
+        <w:spacing w:before="322" w:after="322" w:line="322" w:lineRule="exact"/>
+        <w:ind w:left="0" w:firstLine="0"/>
+        <w:jc w:val="left"/>
+      </w:pPr>
+      <w:r>
+        <w:rPr>
+          <w:b/>
+          <w:bCs/>
+        </w:rPr>
+        <w:t xml:space="preserve">B.</w:t>
+      </w:r>
+      <w:r>
+        <w:rPr>
+          <w:b/>
+          <w:bCs/>
+        </w:rPr>
+        <w:t xml:space="preserve"> </w:t>
+      </w:r>
+      <w:r>
+        <w:rPr>
+          <w:b/>
+          <w:bCs/>
+        </w:rPr>
+        <w:t xml:space="preserve">Count</w:t>
+      </w:r>
+      <w:r>
+        <w:rPr>
+          <w:b/>
+          <w:bCs/>
+        </w:rPr>
+        <w:t xml:space="preserve"> </w:t>
+      </w:r>
+      <w:r>
+        <w:rPr>
+          <w:b/>
+          <w:bCs/>
+        </w:rPr>
+        <w:t xml:space="preserve">One</w:t>
+      </w:r>
+      <w:r>
+        <w:rPr>
+          <w:b/>
+          <w:bCs/>
+        </w:rPr>
+        <w:t xml:space="preserve"> </w:t>
+      </w:r>
+      <w:r>
+        <w:rPr>
+          <w:b/>
+          <w:bCs/>
+        </w:rPr>
+        <w:t xml:space="preserve">–</w:t>
+      </w:r>
+      <w:r>
+        <w:rPr>
+          <w:b/>
+          <w:bCs/>
+        </w:rPr>
+        <w:t xml:space="preserve"> </w:t>
+      </w:r>
+      <w:r>
+        <w:rPr>
+          <w:b/>
+          <w:bCs/>
+        </w:rPr>
+        <w:t xml:space="preserve">First</w:t>
+      </w:r>
+      <w:r>
+        <w:rPr>
+          <w:b/>
+          <w:bCs/>
+        </w:rPr>
+        <w:t xml:space="preserve"> </w:t>
+      </w:r>
+      <w:r>
+        <w:rPr>
+          <w:b/>
+          <w:bCs/>
+        </w:rPr>
+        <w:t xml:space="preserve">Amendment</w:t>
       </w:r>
     </w:p>
     <w:p>
@@ -549,20 +1035,1792 @@
         <w:pStyle w:val="BodyText"/>
       </w:pPr>
       <w:r>
-        <w:t xml:space="preserve">Ms. Durand previously has asserted that 244 Washington is a limited public forum and that the challenged restriction violates the First Amendment because it is not “narrowly tailored and does not leave open ample alternative channels of communication.” Doc. 2-1 at 10-11. She is correct on the first point, but not on the second. To be sure, the standard has only recently been clarified by the Eleventh Circuit, and from that decision the following excerpt is instructive:</w:t>
-      </w:r>
-    </w:p>
-    <w:p>
-      <w:pPr>
-        <w:pStyle w:val="BlockText"/>
-      </w:pPr>
-      <w:r>
-        <w:t xml:space="preserve">We have long understood the commonsense point that the Constitution does not require the government to ‘grant access to all who wish to exercise their right to free speech,’ no matter the setting, ‘without regard to the nature of the property or to the disruption that might be caused by the speaker’s activities.’ Cornelius v. NAACP Legal Def. &amp; Educ. Fund, Inc., 473 U.S. 788, 799-800, 105 S. Ct. 3439, 87 L. Ed. 2d 567 (1985). Disallowing any limits whatsoever in all government spaces would often lead to chaos, and could even keep the government from fulfilling its lawful functions. But that is not a license to evade the First Amendment, which demands a close look when the government restricts speech. Enter forum analysis, which considers ‘when the Government’s interest in limiting the use of its property to its intended purpose outweighs the interest of those wishing to use the property for other purposes.” Id. at 800. The government’s ability to impose restrictions on speech varies depending on the nature of the forum. See Keister v. Bell, 29 F.4th 1239, 1251 (11th Cir. 2022); Perry Educ. Ass’n v. Perry Loc. Educators’ Ass’n, 460 U.S. 37, 44, 103 S. Ct. 948, 74 L. Ed. 2d 794 (1983). The Supreme Court has recognized four types: the traditional public forum, the designated public forum, the limited public forum, and the nonpublic forum. See Walker v. Texas Div., Sons of Confederate Veterans, Inc., 576 U.S. 200, 215-16, 135 S. Ct. 2239, 192 L. Ed. 2d 274 (2015). Content restrictions in the first two categories are reviewed under strict scrutiny, while regulations in the latter two survive so long as they are viewpoint neutral and reasonable. McDonough v. Garcia, 116 F.4th 1319, 1322 (11th Cir. 2024).</w:t>
-      </w:r>
-    </w:p>
-    <w:p>
-      <w:pPr>
-        <w:pStyle w:val="FirstParagraph"/>
+        <w:t xml:space="preserve">The restriction in issue is a reasonable security response and precaution. It is based on Ms. Durand’s admitted (and video documented) unlawful conduct, not her speech or viewpoint. The complaint includes no plausible, non-conclusory fact allegation to the contrary. It pleads that Ms. Durand is politically active. Doc. 1, ¶¶ 1, 10</w:t>
+      </w:r>
+      <w:r>
+        <w:noBreakHyphen/>
+      </w:r>
+      <w:r>
+        <w:t xml:space="preserve">18. But it does not show that Lieutenant Hayes, or the Capitol Police, knew of her political or expressive activities and imposed the restriction because of them. The restriction is implemented and enforced by the Capitol Police Division, which is the arm of the Georgia DPS that is charged with maintaining public safety and security in and around the State Capitol.</w:t>
+      </w:r>
+    </w:p>
+    <w:p>
+      <w:pPr>
+        <w:pStyle w:val="BodyText"/>
+      </w:pPr>
+      <w:r>
+        <w:t xml:space="preserve">Ms. Durand previously has asserted that 244 Washington is a limited public forum and that the challenged restriction violates the First Amendment because it is not “narrowly tailored and does not leave open ample alternative channels of communication.” Doc. 2</w:t>
+      </w:r>
+      <w:r>
+        <w:noBreakHyphen/>
+      </w:r>
+      <w:r>
+        <w:t xml:space="preserve">1 at 10</w:t>
+      </w:r>
+      <w:r>
+        <w:noBreakHyphen/>
+      </w:r>
+      <w:r>
+        <w:t xml:space="preserve">11. She is correct on the first point, but not on the second. To be sure, the standard has only recently been clarified by the Eleventh Circuit, and from that decision the following excerpt is instructive:</w:t>
+      </w:r>
+    </w:p>
+    <w:p>
+      <w:pPr>
+        <w:spacing w:before="322" w:after="322" w:line="322" w:lineRule="exact"/>
+        <w:ind w:left="720" w:right="720" w:firstLine="0"/>
+        <w:jc w:val="left"/>
+      </w:pPr>
+      <w:r>
+        <w:t xml:space="preserve">We</w:t>
+      </w:r>
+      <w:r>
+        <w:t xml:space="preserve"> </w:t>
+      </w:r>
+      <w:r>
+        <w:t xml:space="preserve">have</w:t>
+      </w:r>
+      <w:r>
+        <w:t xml:space="preserve"> </w:t>
+      </w:r>
+      <w:r>
+        <w:t xml:space="preserve">long</w:t>
+      </w:r>
+      <w:r>
+        <w:t xml:space="preserve"> </w:t>
+      </w:r>
+      <w:r>
+        <w:t xml:space="preserve">understood</w:t>
+      </w:r>
+      <w:r>
+        <w:t xml:space="preserve"> </w:t>
+      </w:r>
+      <w:r>
+        <w:t xml:space="preserve">the</w:t>
+      </w:r>
+      <w:r>
+        <w:t xml:space="preserve"> </w:t>
+      </w:r>
+      <w:r>
+        <w:t xml:space="preserve">commonsense</w:t>
+      </w:r>
+      <w:r>
+        <w:t xml:space="preserve"> </w:t>
+      </w:r>
+      <w:r>
+        <w:t xml:space="preserve">point</w:t>
+      </w:r>
+      <w:r>
+        <w:t xml:space="preserve"> </w:t>
+      </w:r>
+      <w:r>
+        <w:t xml:space="preserve">that</w:t>
+      </w:r>
+      <w:r>
+        <w:t xml:space="preserve"> </w:t>
+      </w:r>
+      <w:r>
+        <w:t xml:space="preserve">the</w:t>
+      </w:r>
+      <w:r>
+        <w:t xml:space="preserve"> </w:t>
+      </w:r>
+      <w:r>
+        <w:t xml:space="preserve">Constitution</w:t>
+      </w:r>
+      <w:r>
+        <w:t xml:space="preserve"> </w:t>
+      </w:r>
+      <w:r>
+        <w:t xml:space="preserve">does</w:t>
+      </w:r>
+      <w:r>
+        <w:t xml:space="preserve"> </w:t>
+      </w:r>
+      <w:r>
+        <w:t xml:space="preserve">not</w:t>
+      </w:r>
+      <w:r>
+        <w:t xml:space="preserve"> </w:t>
+      </w:r>
+      <w:r>
+        <w:t xml:space="preserve">require</w:t>
+      </w:r>
+      <w:r>
+        <w:t xml:space="preserve"> </w:t>
+      </w:r>
+      <w:r>
+        <w:t xml:space="preserve">the</w:t>
+      </w:r>
+      <w:r>
+        <w:t xml:space="preserve"> </w:t>
+      </w:r>
+      <w:r>
+        <w:t xml:space="preserve">government</w:t>
+      </w:r>
+      <w:r>
+        <w:t xml:space="preserve"> </w:t>
+      </w:r>
+      <w:r>
+        <w:t xml:space="preserve">to</w:t>
+      </w:r>
+      <w:r>
+        <w:t xml:space="preserve"> </w:t>
+      </w:r>
+      <w:r>
+        <w:t xml:space="preserve">‘grant</w:t>
+      </w:r>
+      <w:r>
+        <w:t xml:space="preserve"> </w:t>
+      </w:r>
+      <w:r>
+        <w:t xml:space="preserve">access</w:t>
+      </w:r>
+      <w:r>
+        <w:t xml:space="preserve"> </w:t>
+      </w:r>
+      <w:r>
+        <w:t xml:space="preserve">to</w:t>
+      </w:r>
+      <w:r>
+        <w:t xml:space="preserve"> </w:t>
+      </w:r>
+      <w:r>
+        <w:t xml:space="preserve">all</w:t>
+      </w:r>
+      <w:r>
+        <w:t xml:space="preserve"> </w:t>
+      </w:r>
+      <w:r>
+        <w:t xml:space="preserve">who</w:t>
+      </w:r>
+      <w:r>
+        <w:t xml:space="preserve"> </w:t>
+      </w:r>
+      <w:r>
+        <w:t xml:space="preserve">wish</w:t>
+      </w:r>
+      <w:r>
+        <w:t xml:space="preserve"> </w:t>
+      </w:r>
+      <w:r>
+        <w:t xml:space="preserve">to</w:t>
+      </w:r>
+      <w:r>
+        <w:t xml:space="preserve"> </w:t>
+      </w:r>
+      <w:r>
+        <w:t xml:space="preserve">exercise</w:t>
+      </w:r>
+      <w:r>
+        <w:t xml:space="preserve"> </w:t>
+      </w:r>
+      <w:r>
+        <w:t xml:space="preserve">their</w:t>
+      </w:r>
+      <w:r>
+        <w:t xml:space="preserve"> </w:t>
+      </w:r>
+      <w:r>
+        <w:t xml:space="preserve">right</w:t>
+      </w:r>
+      <w:r>
+        <w:t xml:space="preserve"> </w:t>
+      </w:r>
+      <w:r>
+        <w:t xml:space="preserve">to</w:t>
+      </w:r>
+      <w:r>
+        <w:t xml:space="preserve"> </w:t>
+      </w:r>
+      <w:r>
+        <w:t xml:space="preserve">free</w:t>
+      </w:r>
+      <w:r>
+        <w:t xml:space="preserve"> </w:t>
+      </w:r>
+      <w:r>
+        <w:t xml:space="preserve">speech,’</w:t>
+      </w:r>
+      <w:r>
+        <w:t xml:space="preserve"> </w:t>
+      </w:r>
+      <w:r>
+        <w:t xml:space="preserve">no</w:t>
+      </w:r>
+      <w:r>
+        <w:t xml:space="preserve"> </w:t>
+      </w:r>
+      <w:r>
+        <w:t xml:space="preserve">matter</w:t>
+      </w:r>
+      <w:r>
+        <w:t xml:space="preserve"> </w:t>
+      </w:r>
+      <w:r>
+        <w:t xml:space="preserve">the</w:t>
+      </w:r>
+      <w:r>
+        <w:t xml:space="preserve"> </w:t>
+      </w:r>
+      <w:r>
+        <w:t xml:space="preserve">setting,</w:t>
+      </w:r>
+      <w:r>
+        <w:t xml:space="preserve"> </w:t>
+      </w:r>
+      <w:r>
+        <w:t xml:space="preserve">‘without</w:t>
+      </w:r>
+      <w:r>
+        <w:t xml:space="preserve"> </w:t>
+      </w:r>
+      <w:r>
+        <w:t xml:space="preserve">regard</w:t>
+      </w:r>
+      <w:r>
+        <w:t xml:space="preserve"> </w:t>
+      </w:r>
+      <w:r>
+        <w:t xml:space="preserve">to</w:t>
+      </w:r>
+      <w:r>
+        <w:t xml:space="preserve"> </w:t>
+      </w:r>
+      <w:r>
+        <w:t xml:space="preserve">the</w:t>
+      </w:r>
+      <w:r>
+        <w:t xml:space="preserve"> </w:t>
+      </w:r>
+      <w:r>
+        <w:t xml:space="preserve">nature</w:t>
+      </w:r>
+      <w:r>
+        <w:t xml:space="preserve"> </w:t>
+      </w:r>
+      <w:r>
+        <w:t xml:space="preserve">of</w:t>
+      </w:r>
+      <w:r>
+        <w:t xml:space="preserve"> </w:t>
+      </w:r>
+      <w:r>
+        <w:t xml:space="preserve">the</w:t>
+      </w:r>
+      <w:r>
+        <w:t xml:space="preserve"> </w:t>
+      </w:r>
+      <w:r>
+        <w:t xml:space="preserve">property</w:t>
+      </w:r>
+      <w:r>
+        <w:t xml:space="preserve"> </w:t>
+      </w:r>
+      <w:r>
+        <w:t xml:space="preserve">or</w:t>
+      </w:r>
+      <w:r>
+        <w:t xml:space="preserve"> </w:t>
+      </w:r>
+      <w:r>
+        <w:t xml:space="preserve">to</w:t>
+      </w:r>
+      <w:r>
+        <w:t xml:space="preserve"> </w:t>
+      </w:r>
+      <w:r>
+        <w:t xml:space="preserve">the</w:t>
+      </w:r>
+      <w:r>
+        <w:t xml:space="preserve"> </w:t>
+      </w:r>
+      <w:r>
+        <w:t xml:space="preserve">disruption</w:t>
+      </w:r>
+      <w:r>
+        <w:t xml:space="preserve"> </w:t>
+      </w:r>
+      <w:r>
+        <w:t xml:space="preserve">that</w:t>
+      </w:r>
+      <w:r>
+        <w:t xml:space="preserve"> </w:t>
+      </w:r>
+      <w:r>
+        <w:t xml:space="preserve">might</w:t>
+      </w:r>
+      <w:r>
+        <w:t xml:space="preserve"> </w:t>
+      </w:r>
+      <w:r>
+        <w:t xml:space="preserve">be</w:t>
+      </w:r>
+      <w:r>
+        <w:t xml:space="preserve"> </w:t>
+      </w:r>
+      <w:r>
+        <w:t xml:space="preserve">caused</w:t>
+      </w:r>
+      <w:r>
+        <w:t xml:space="preserve"> </w:t>
+      </w:r>
+      <w:r>
+        <w:t xml:space="preserve">by</w:t>
+      </w:r>
+      <w:r>
+        <w:t xml:space="preserve"> </w:t>
+      </w:r>
+      <w:r>
+        <w:t xml:space="preserve">the</w:t>
+      </w:r>
+      <w:r>
+        <w:t xml:space="preserve"> </w:t>
+      </w:r>
+      <w:r>
+        <w:t xml:space="preserve">speaker’s</w:t>
+      </w:r>
+      <w:r>
+        <w:t xml:space="preserve"> </w:t>
+      </w:r>
+      <w:r>
+        <w:t xml:space="preserve">activities.’</w:t>
+      </w:r>
+      <w:r>
+        <w:t xml:space="preserve"> </w:t>
+      </w:r>
+      <w:r>
+        <w:t xml:space="preserve">Cornelius</w:t>
+      </w:r>
+      <w:r>
+        <w:t xml:space="preserve"> </w:t>
+      </w:r>
+      <w:r>
+        <w:t xml:space="preserve">v.</w:t>
+      </w:r>
+      <w:r>
+        <w:t xml:space="preserve"> </w:t>
+      </w:r>
+      <w:r>
+        <w:t xml:space="preserve">NAACP</w:t>
+      </w:r>
+      <w:r>
+        <w:t xml:space="preserve"> </w:t>
+      </w:r>
+      <w:r>
+        <w:t xml:space="preserve">Legal</w:t>
+      </w:r>
+      <w:r>
+        <w:t xml:space="preserve"> </w:t>
+      </w:r>
+      <w:r>
+        <w:t xml:space="preserve">Def.</w:t>
+      </w:r>
+      <w:r>
+        <w:t xml:space="preserve"> </w:t>
+      </w:r>
+      <w:r>
+        <w:t xml:space="preserve">&amp;</w:t>
+      </w:r>
+      <w:r>
+        <w:t xml:space="preserve"> </w:t>
+      </w:r>
+      <w:r>
+        <w:t xml:space="preserve">Educ.</w:t>
+      </w:r>
+      <w:r>
+        <w:t xml:space="preserve"> </w:t>
+      </w:r>
+      <w:r>
+        <w:t xml:space="preserve">Fund,</w:t>
+      </w:r>
+      <w:r>
+        <w:t xml:space="preserve"> </w:t>
+      </w:r>
+      <w:r>
+        <w:t xml:space="preserve">Inc.,</w:t>
+      </w:r>
+      <w:r>
+        <w:t xml:space="preserve"> </w:t>
+      </w:r>
+      <w:r>
+        <w:t xml:space="preserve">473</w:t>
+      </w:r>
+      <w:r>
+        <w:t xml:space="preserve"> </w:t>
+      </w:r>
+      <w:r>
+        <w:t xml:space="preserve">U.S.</w:t>
+      </w:r>
+      <w:r>
+        <w:t xml:space="preserve"> </w:t>
+      </w:r>
+      <w:r>
+        <w:t xml:space="preserve">788,</w:t>
+      </w:r>
+      <w:r>
+        <w:t xml:space="preserve"> </w:t>
+      </w:r>
+      <w:r>
+        <w:t xml:space="preserve">799</w:t>
+        <w:noBreakHyphen/>
+        <w:t xml:space="preserve">800,</w:t>
+      </w:r>
+      <w:r>
+        <w:t xml:space="preserve"> </w:t>
+      </w:r>
+      <w:r>
+        <w:t xml:space="preserve">105</w:t>
+      </w:r>
+      <w:r>
+        <w:t xml:space="preserve"> </w:t>
+      </w:r>
+      <w:r>
+        <w:t xml:space="preserve">S.</w:t>
+      </w:r>
+      <w:r>
+        <w:t xml:space="preserve"> </w:t>
+      </w:r>
+      <w:r>
+        <w:t xml:space="preserve">Ct.</w:t>
+      </w:r>
+      <w:r>
+        <w:t xml:space="preserve"> </w:t>
+      </w:r>
+      <w:r>
+        <w:t xml:space="preserve">3439,</w:t>
+      </w:r>
+      <w:r>
+        <w:t xml:space="preserve"> </w:t>
+      </w:r>
+      <w:r>
+        <w:t xml:space="preserve">87</w:t>
+      </w:r>
+      <w:r>
+        <w:t xml:space="preserve"> </w:t>
+      </w:r>
+      <w:r>
+        <w:t xml:space="preserve">L.</w:t>
+      </w:r>
+      <w:r>
+        <w:t xml:space="preserve"> </w:t>
+      </w:r>
+      <w:r>
+        <w:t xml:space="preserve">Ed.</w:t>
+      </w:r>
+      <w:r>
+        <w:t xml:space="preserve"> </w:t>
+      </w:r>
+      <w:r>
+        <w:t xml:space="preserve">2d</w:t>
+      </w:r>
+      <w:r>
+        <w:t xml:space="preserve"> </w:t>
+      </w:r>
+      <w:r>
+        <w:t xml:space="preserve">567</w:t>
+      </w:r>
+      <w:r>
+        <w:t xml:space="preserve"> </w:t>
+      </w:r>
+      <w:r>
+        <w:t xml:space="preserve">(1985).</w:t>
+      </w:r>
+      <w:r>
+        <w:t xml:space="preserve"> </w:t>
+      </w:r>
+      <w:r>
+        <w:t xml:space="preserve">Disallowing</w:t>
+      </w:r>
+      <w:r>
+        <w:t xml:space="preserve"> </w:t>
+      </w:r>
+      <w:r>
+        <w:t xml:space="preserve">any</w:t>
+      </w:r>
+      <w:r>
+        <w:t xml:space="preserve"> </w:t>
+      </w:r>
+      <w:r>
+        <w:t xml:space="preserve">limits</w:t>
+      </w:r>
+      <w:r>
+        <w:t xml:space="preserve"> </w:t>
+      </w:r>
+      <w:r>
+        <w:t xml:space="preserve">whatsoever</w:t>
+      </w:r>
+      <w:r>
+        <w:t xml:space="preserve"> </w:t>
+      </w:r>
+      <w:r>
+        <w:t xml:space="preserve">in</w:t>
+      </w:r>
+      <w:r>
+        <w:t xml:space="preserve"> </w:t>
+      </w:r>
+      <w:r>
+        <w:t xml:space="preserve">all</w:t>
+      </w:r>
+      <w:r>
+        <w:t xml:space="preserve"> </w:t>
+      </w:r>
+      <w:r>
+        <w:t xml:space="preserve">government</w:t>
+      </w:r>
+      <w:r>
+        <w:t xml:space="preserve"> </w:t>
+      </w:r>
+      <w:r>
+        <w:t xml:space="preserve">spaces</w:t>
+      </w:r>
+      <w:r>
+        <w:t xml:space="preserve"> </w:t>
+      </w:r>
+      <w:r>
+        <w:t xml:space="preserve">would</w:t>
+      </w:r>
+      <w:r>
+        <w:t xml:space="preserve"> </w:t>
+      </w:r>
+      <w:r>
+        <w:t xml:space="preserve">often</w:t>
+      </w:r>
+      <w:r>
+        <w:t xml:space="preserve"> </w:t>
+      </w:r>
+      <w:r>
+        <w:t xml:space="preserve">lead</w:t>
+      </w:r>
+      <w:r>
+        <w:t xml:space="preserve"> </w:t>
+      </w:r>
+      <w:r>
+        <w:t xml:space="preserve">to</w:t>
+      </w:r>
+      <w:r>
+        <w:t xml:space="preserve"> </w:t>
+      </w:r>
+      <w:r>
+        <w:t xml:space="preserve">chaos,</w:t>
+      </w:r>
+      <w:r>
+        <w:t xml:space="preserve"> </w:t>
+      </w:r>
+      <w:r>
+        <w:t xml:space="preserve">and</w:t>
+      </w:r>
+      <w:r>
+        <w:t xml:space="preserve"> </w:t>
+      </w:r>
+      <w:r>
+        <w:t xml:space="preserve">could</w:t>
+      </w:r>
+      <w:r>
+        <w:t xml:space="preserve"> </w:t>
+      </w:r>
+      <w:r>
+        <w:t xml:space="preserve">even</w:t>
+      </w:r>
+      <w:r>
+        <w:t xml:space="preserve"> </w:t>
+      </w:r>
+      <w:r>
+        <w:t xml:space="preserve">keep</w:t>
+      </w:r>
+      <w:r>
+        <w:t xml:space="preserve"> </w:t>
+      </w:r>
+      <w:r>
+        <w:t xml:space="preserve">the</w:t>
+      </w:r>
+      <w:r>
+        <w:t xml:space="preserve"> </w:t>
+      </w:r>
+      <w:r>
+        <w:t xml:space="preserve">government</w:t>
+      </w:r>
+      <w:r>
+        <w:t xml:space="preserve"> </w:t>
+      </w:r>
+      <w:r>
+        <w:t xml:space="preserve">from</w:t>
+      </w:r>
+      <w:r>
+        <w:t xml:space="preserve"> </w:t>
+      </w:r>
+      <w:r>
+        <w:t xml:space="preserve">fulfilling</w:t>
+      </w:r>
+      <w:r>
+        <w:t xml:space="preserve"> </w:t>
+      </w:r>
+      <w:r>
+        <w:t xml:space="preserve">its</w:t>
+      </w:r>
+      <w:r>
+        <w:t xml:space="preserve"> </w:t>
+      </w:r>
+      <w:r>
+        <w:t xml:space="preserve">lawful</w:t>
+      </w:r>
+      <w:r>
+        <w:t xml:space="preserve"> </w:t>
+      </w:r>
+      <w:r>
+        <w:t xml:space="preserve">functions.</w:t>
+      </w:r>
+      <w:r>
+        <w:t xml:space="preserve"> </w:t>
+      </w:r>
+      <w:r>
+        <w:t xml:space="preserve">But</w:t>
+      </w:r>
+      <w:r>
+        <w:t xml:space="preserve"> </w:t>
+      </w:r>
+      <w:r>
+        <w:t xml:space="preserve">that</w:t>
+      </w:r>
+      <w:r>
+        <w:t xml:space="preserve"> </w:t>
+      </w:r>
+      <w:r>
+        <w:t xml:space="preserve">is</w:t>
+      </w:r>
+      <w:r>
+        <w:t xml:space="preserve"> </w:t>
+      </w:r>
+      <w:r>
+        <w:t xml:space="preserve">not</w:t>
+      </w:r>
+      <w:r>
+        <w:t xml:space="preserve"> </w:t>
+      </w:r>
+      <w:r>
+        <w:t xml:space="preserve">a</w:t>
+      </w:r>
+      <w:r>
+        <w:t xml:space="preserve"> </w:t>
+      </w:r>
+      <w:r>
+        <w:t xml:space="preserve">license</w:t>
+      </w:r>
+      <w:r>
+        <w:t xml:space="preserve"> </w:t>
+      </w:r>
+      <w:r>
+        <w:t xml:space="preserve">to</w:t>
+      </w:r>
+      <w:r>
+        <w:t xml:space="preserve"> </w:t>
+      </w:r>
+      <w:r>
+        <w:t xml:space="preserve">evade</w:t>
+      </w:r>
+      <w:r>
+        <w:t xml:space="preserve"> </w:t>
+      </w:r>
+      <w:r>
+        <w:t xml:space="preserve">the</w:t>
+      </w:r>
+      <w:r>
+        <w:t xml:space="preserve"> </w:t>
+      </w:r>
+      <w:r>
+        <w:t xml:space="preserve">First</w:t>
+      </w:r>
+      <w:r>
+        <w:t xml:space="preserve"> </w:t>
+      </w:r>
+      <w:r>
+        <w:t xml:space="preserve">Amendment,</w:t>
+      </w:r>
+      <w:r>
+        <w:t xml:space="preserve"> </w:t>
+      </w:r>
+      <w:r>
+        <w:t xml:space="preserve">which</w:t>
+      </w:r>
+      <w:r>
+        <w:t xml:space="preserve"> </w:t>
+      </w:r>
+      <w:r>
+        <w:t xml:space="preserve">demands</w:t>
+      </w:r>
+      <w:r>
+        <w:t xml:space="preserve"> </w:t>
+      </w:r>
+      <w:r>
+        <w:t xml:space="preserve">a</w:t>
+      </w:r>
+      <w:r>
+        <w:t xml:space="preserve"> </w:t>
+      </w:r>
+      <w:r>
+        <w:t xml:space="preserve">close</w:t>
+      </w:r>
+      <w:r>
+        <w:t xml:space="preserve"> </w:t>
+      </w:r>
+      <w:r>
+        <w:t xml:space="preserve">look</w:t>
+      </w:r>
+      <w:r>
+        <w:t xml:space="preserve"> </w:t>
+      </w:r>
+      <w:r>
+        <w:t xml:space="preserve">when</w:t>
+      </w:r>
+      <w:r>
+        <w:t xml:space="preserve"> </w:t>
+      </w:r>
+      <w:r>
+        <w:t xml:space="preserve">the</w:t>
+      </w:r>
+      <w:r>
+        <w:t xml:space="preserve"> </w:t>
+      </w:r>
+      <w:r>
+        <w:t xml:space="preserve">government</w:t>
+      </w:r>
+      <w:r>
+        <w:t xml:space="preserve"> </w:t>
+      </w:r>
+      <w:r>
+        <w:t xml:space="preserve">restricts</w:t>
+      </w:r>
+      <w:r>
+        <w:t xml:space="preserve"> </w:t>
+      </w:r>
+      <w:r>
+        <w:t xml:space="preserve">speech.</w:t>
+      </w:r>
+      <w:r>
+        <w:t xml:space="preserve"> </w:t>
+      </w:r>
+      <w:r>
+        <w:t xml:space="preserve">Enter</w:t>
+      </w:r>
+      <w:r>
+        <w:t xml:space="preserve"> </w:t>
+      </w:r>
+      <w:r>
+        <w:t xml:space="preserve">forum</w:t>
+      </w:r>
+      <w:r>
+        <w:t xml:space="preserve"> </w:t>
+      </w:r>
+      <w:r>
+        <w:t xml:space="preserve">analysis,</w:t>
+      </w:r>
+      <w:r>
+        <w:t xml:space="preserve"> </w:t>
+      </w:r>
+      <w:r>
+        <w:t xml:space="preserve">which</w:t>
+      </w:r>
+      <w:r>
+        <w:t xml:space="preserve"> </w:t>
+      </w:r>
+      <w:r>
+        <w:t xml:space="preserve">considers</w:t>
+      </w:r>
+      <w:r>
+        <w:t xml:space="preserve"> </w:t>
+      </w:r>
+      <w:r>
+        <w:t xml:space="preserve">‘when</w:t>
+      </w:r>
+      <w:r>
+        <w:t xml:space="preserve"> </w:t>
+      </w:r>
+      <w:r>
+        <w:t xml:space="preserve">the</w:t>
+      </w:r>
+      <w:r>
+        <w:t xml:space="preserve"> </w:t>
+      </w:r>
+      <w:r>
+        <w:t xml:space="preserve">Government’s</w:t>
+      </w:r>
+      <w:r>
+        <w:t xml:space="preserve"> </w:t>
+      </w:r>
+      <w:r>
+        <w:t xml:space="preserve">interest</w:t>
+      </w:r>
+      <w:r>
+        <w:t xml:space="preserve"> </w:t>
+      </w:r>
+      <w:r>
+        <w:t xml:space="preserve">in</w:t>
+      </w:r>
+      <w:r>
+        <w:t xml:space="preserve"> </w:t>
+      </w:r>
+      <w:r>
+        <w:t xml:space="preserve">limiting</w:t>
+      </w:r>
+      <w:r>
+        <w:t xml:space="preserve"> </w:t>
+      </w:r>
+      <w:r>
+        <w:t xml:space="preserve">the</w:t>
+      </w:r>
+      <w:r>
+        <w:t xml:space="preserve"> </w:t>
+      </w:r>
+      <w:r>
+        <w:t xml:space="preserve">use</w:t>
+      </w:r>
+      <w:r>
+        <w:t xml:space="preserve"> </w:t>
+      </w:r>
+      <w:r>
+        <w:t xml:space="preserve">of</w:t>
+      </w:r>
+      <w:r>
+        <w:t xml:space="preserve"> </w:t>
+      </w:r>
+      <w:r>
+        <w:t xml:space="preserve">its</w:t>
+      </w:r>
+      <w:r>
+        <w:t xml:space="preserve"> </w:t>
+      </w:r>
+      <w:r>
+        <w:t xml:space="preserve">property</w:t>
+      </w:r>
+      <w:r>
+        <w:t xml:space="preserve"> </w:t>
+      </w:r>
+      <w:r>
+        <w:t xml:space="preserve">to</w:t>
+      </w:r>
+      <w:r>
+        <w:t xml:space="preserve"> </w:t>
+      </w:r>
+      <w:r>
+        <w:t xml:space="preserve">its</w:t>
+      </w:r>
+      <w:r>
+        <w:t xml:space="preserve"> </w:t>
+      </w:r>
+      <w:r>
+        <w:t xml:space="preserve">intended</w:t>
+      </w:r>
+      <w:r>
+        <w:t xml:space="preserve"> </w:t>
+      </w:r>
+      <w:r>
+        <w:t xml:space="preserve">purpose</w:t>
+      </w:r>
+      <w:r>
+        <w:t xml:space="preserve"> </w:t>
+      </w:r>
+      <w:r>
+        <w:t xml:space="preserve">outweighs</w:t>
+      </w:r>
+      <w:r>
+        <w:t xml:space="preserve"> </w:t>
+      </w:r>
+      <w:r>
+        <w:t xml:space="preserve">the</w:t>
+      </w:r>
+      <w:r>
+        <w:t xml:space="preserve"> </w:t>
+      </w:r>
+      <w:r>
+        <w:t xml:space="preserve">interest</w:t>
+      </w:r>
+      <w:r>
+        <w:t xml:space="preserve"> </w:t>
+      </w:r>
+      <w:r>
+        <w:t xml:space="preserve">of</w:t>
+      </w:r>
+      <w:r>
+        <w:t xml:space="preserve"> </w:t>
+      </w:r>
+      <w:r>
+        <w:t xml:space="preserve">those</w:t>
+      </w:r>
+      <w:r>
+        <w:t xml:space="preserve"> </w:t>
+      </w:r>
+      <w:r>
+        <w:t xml:space="preserve">wishing</w:t>
+      </w:r>
+      <w:r>
+        <w:t xml:space="preserve"> </w:t>
+      </w:r>
+      <w:r>
+        <w:t xml:space="preserve">to</w:t>
+      </w:r>
+      <w:r>
+        <w:t xml:space="preserve"> </w:t>
+      </w:r>
+      <w:r>
+        <w:t xml:space="preserve">use</w:t>
+      </w:r>
+      <w:r>
+        <w:t xml:space="preserve"> </w:t>
+      </w:r>
+      <w:r>
+        <w:t xml:space="preserve">the</w:t>
+      </w:r>
+      <w:r>
+        <w:t xml:space="preserve"> </w:t>
+      </w:r>
+      <w:r>
+        <w:t xml:space="preserve">property</w:t>
+      </w:r>
+      <w:r>
+        <w:t xml:space="preserve"> </w:t>
+      </w:r>
+      <w:r>
+        <w:t xml:space="preserve">for</w:t>
+      </w:r>
+      <w:r>
+        <w:t xml:space="preserve"> </w:t>
+      </w:r>
+      <w:r>
+        <w:t xml:space="preserve">other</w:t>
+      </w:r>
+      <w:r>
+        <w:t xml:space="preserve"> </w:t>
+      </w:r>
+      <w:r>
+        <w:t xml:space="preserve">purposes.”</w:t>
+      </w:r>
+      <w:r>
+        <w:t xml:space="preserve"> </w:t>
+      </w:r>
+      <w:r>
+        <w:t xml:space="preserve">Id.</w:t>
+      </w:r>
+      <w:r>
+        <w:t xml:space="preserve"> </w:t>
+      </w:r>
+      <w:r>
+        <w:t xml:space="preserve">at</w:t>
+      </w:r>
+      <w:r>
+        <w:t xml:space="preserve"> </w:t>
+      </w:r>
+      <w:r>
+        <w:t xml:space="preserve">800.</w:t>
+      </w:r>
+      <w:r>
+        <w:t xml:space="preserve"> </w:t>
+      </w:r>
+      <w:r>
+        <w:t xml:space="preserve">The</w:t>
+      </w:r>
+      <w:r>
+        <w:t xml:space="preserve"> </w:t>
+      </w:r>
+      <w:r>
+        <w:t xml:space="preserve">government’s</w:t>
+      </w:r>
+      <w:r>
+        <w:t xml:space="preserve"> </w:t>
+      </w:r>
+      <w:r>
+        <w:t xml:space="preserve">ability</w:t>
+      </w:r>
+      <w:r>
+        <w:t xml:space="preserve"> </w:t>
+      </w:r>
+      <w:r>
+        <w:t xml:space="preserve">to</w:t>
+      </w:r>
+      <w:r>
+        <w:t xml:space="preserve"> </w:t>
+      </w:r>
+      <w:r>
+        <w:t xml:space="preserve">impose</w:t>
+      </w:r>
+      <w:r>
+        <w:t xml:space="preserve"> </w:t>
+      </w:r>
+      <w:r>
+        <w:t xml:space="preserve">restrictions</w:t>
+      </w:r>
+      <w:r>
+        <w:t xml:space="preserve"> </w:t>
+      </w:r>
+      <w:r>
+        <w:t xml:space="preserve">on</w:t>
+      </w:r>
+      <w:r>
+        <w:t xml:space="preserve"> </w:t>
+      </w:r>
+      <w:r>
+        <w:t xml:space="preserve">speech</w:t>
+      </w:r>
+      <w:r>
+        <w:t xml:space="preserve"> </w:t>
+      </w:r>
+      <w:r>
+        <w:t xml:space="preserve">varies</w:t>
+      </w:r>
+      <w:r>
+        <w:t xml:space="preserve"> </w:t>
+      </w:r>
+      <w:r>
+        <w:t xml:space="preserve">depending</w:t>
+      </w:r>
+      <w:r>
+        <w:t xml:space="preserve"> </w:t>
+      </w:r>
+      <w:r>
+        <w:t xml:space="preserve">on</w:t>
+      </w:r>
+      <w:r>
+        <w:t xml:space="preserve"> </w:t>
+      </w:r>
+      <w:r>
+        <w:t xml:space="preserve">the</w:t>
+      </w:r>
+      <w:r>
+        <w:t xml:space="preserve"> </w:t>
+      </w:r>
+      <w:r>
+        <w:t xml:space="preserve">nature</w:t>
+      </w:r>
+      <w:r>
+        <w:t xml:space="preserve"> </w:t>
+      </w:r>
+      <w:r>
+        <w:t xml:space="preserve">of</w:t>
+      </w:r>
+      <w:r>
+        <w:t xml:space="preserve"> </w:t>
+      </w:r>
+      <w:r>
+        <w:t xml:space="preserve">the</w:t>
+      </w:r>
+      <w:r>
+        <w:t xml:space="preserve"> </w:t>
+      </w:r>
+      <w:r>
+        <w:t xml:space="preserve">forum.</w:t>
+      </w:r>
+      <w:r>
+        <w:t xml:space="preserve"> </w:t>
+      </w:r>
+      <w:r>
+        <w:t xml:space="preserve">See</w:t>
+      </w:r>
+      <w:r>
+        <w:t xml:space="preserve"> </w:t>
+      </w:r>
+      <w:r>
+        <w:t xml:space="preserve">Keister</w:t>
+      </w:r>
+      <w:r>
+        <w:t xml:space="preserve"> </w:t>
+      </w:r>
+      <w:r>
+        <w:t xml:space="preserve">v.</w:t>
+      </w:r>
+      <w:r>
+        <w:t xml:space="preserve"> </w:t>
+      </w:r>
+      <w:r>
+        <w:t xml:space="preserve">Bell,</w:t>
+      </w:r>
+      <w:r>
+        <w:t xml:space="preserve"> </w:t>
+      </w:r>
+      <w:r>
+        <w:t xml:space="preserve">29</w:t>
+      </w:r>
+      <w:r>
+        <w:t xml:space="preserve"> </w:t>
+      </w:r>
+      <w:r>
+        <w:t xml:space="preserve">F.4th</w:t>
+      </w:r>
+      <w:r>
+        <w:t xml:space="preserve"> </w:t>
+      </w:r>
+      <w:r>
+        <w:t xml:space="preserve">1239,</w:t>
+      </w:r>
+      <w:r>
+        <w:t xml:space="preserve"> </w:t>
+      </w:r>
+      <w:r>
+        <w:t xml:space="preserve">1251</w:t>
+      </w:r>
+      <w:r>
+        <w:t xml:space="preserve"> </w:t>
+      </w:r>
+      <w:r>
+        <w:t xml:space="preserve">(11th</w:t>
+      </w:r>
+      <w:r>
+        <w:t xml:space="preserve"> </w:t>
+      </w:r>
+      <w:r>
+        <w:t xml:space="preserve">Cir.</w:t>
+      </w:r>
+      <w:r>
+        <w:t xml:space="preserve"> </w:t>
+      </w:r>
+      <w:r>
+        <w:t xml:space="preserve">2022);</w:t>
+      </w:r>
+      <w:r>
+        <w:t xml:space="preserve"> </w:t>
+      </w:r>
+      <w:r>
+        <w:t xml:space="preserve">Perry</w:t>
+      </w:r>
+      <w:r>
+        <w:t xml:space="preserve"> </w:t>
+      </w:r>
+      <w:r>
+        <w:t xml:space="preserve">Educ.</w:t>
+      </w:r>
+      <w:r>
+        <w:t xml:space="preserve"> </w:t>
+      </w:r>
+      <w:r>
+        <w:t xml:space="preserve">Ass’n</w:t>
+      </w:r>
+      <w:r>
+        <w:t xml:space="preserve"> </w:t>
+      </w:r>
+      <w:r>
+        <w:t xml:space="preserve">v.</w:t>
+      </w:r>
+      <w:r>
+        <w:t xml:space="preserve"> </w:t>
+      </w:r>
+      <w:r>
+        <w:t xml:space="preserve">Perry</w:t>
+      </w:r>
+      <w:r>
+        <w:t xml:space="preserve"> </w:t>
+      </w:r>
+      <w:r>
+        <w:t xml:space="preserve">Loc.</w:t>
+      </w:r>
+      <w:r>
+        <w:t xml:space="preserve"> </w:t>
+      </w:r>
+      <w:r>
+        <w:t xml:space="preserve">Educators’</w:t>
+      </w:r>
+      <w:r>
+        <w:t xml:space="preserve"> </w:t>
+      </w:r>
+      <w:r>
+        <w:t xml:space="preserve">Ass’n,</w:t>
+      </w:r>
+      <w:r>
+        <w:t xml:space="preserve"> </w:t>
+      </w:r>
+      <w:r>
+        <w:t xml:space="preserve">460</w:t>
+      </w:r>
+      <w:r>
+        <w:t xml:space="preserve"> </w:t>
+      </w:r>
+      <w:r>
+        <w:t xml:space="preserve">U.S.</w:t>
+      </w:r>
+      <w:r>
+        <w:t xml:space="preserve"> </w:t>
+      </w:r>
+      <w:r>
+        <w:t xml:space="preserve">37,</w:t>
+      </w:r>
+      <w:r>
+        <w:t xml:space="preserve"> </w:t>
+      </w:r>
+      <w:r>
+        <w:t xml:space="preserve">44,</w:t>
+      </w:r>
+      <w:r>
+        <w:t xml:space="preserve"> </w:t>
+      </w:r>
+      <w:r>
+        <w:t xml:space="preserve">103</w:t>
+      </w:r>
+      <w:r>
+        <w:t xml:space="preserve"> </w:t>
+      </w:r>
+      <w:r>
+        <w:t xml:space="preserve">S.</w:t>
+      </w:r>
+      <w:r>
+        <w:t xml:space="preserve"> </w:t>
+      </w:r>
+      <w:r>
+        <w:t xml:space="preserve">Ct.</w:t>
+      </w:r>
+      <w:r>
+        <w:t xml:space="preserve"> </w:t>
+      </w:r>
+      <w:r>
+        <w:t xml:space="preserve">948,</w:t>
+      </w:r>
+      <w:r>
+        <w:t xml:space="preserve"> </w:t>
+      </w:r>
+      <w:r>
+        <w:t xml:space="preserve">74</w:t>
+      </w:r>
+      <w:r>
+        <w:t xml:space="preserve"> </w:t>
+      </w:r>
+      <w:r>
+        <w:t xml:space="preserve">L.</w:t>
+      </w:r>
+      <w:r>
+        <w:t xml:space="preserve"> </w:t>
+      </w:r>
+      <w:r>
+        <w:t xml:space="preserve">Ed.</w:t>
+      </w:r>
+      <w:r>
+        <w:t xml:space="preserve"> </w:t>
+      </w:r>
+      <w:r>
+        <w:t xml:space="preserve">2d</w:t>
+      </w:r>
+      <w:r>
+        <w:t xml:space="preserve"> </w:t>
+      </w:r>
+      <w:r>
+        <w:t xml:space="preserve">794</w:t>
+      </w:r>
+      <w:r>
+        <w:t xml:space="preserve"> </w:t>
+      </w:r>
+      <w:r>
+        <w:t xml:space="preserve">(1983).</w:t>
+      </w:r>
+      <w:r>
+        <w:t xml:space="preserve"> </w:t>
+      </w:r>
+      <w:r>
+        <w:t xml:space="preserve">The</w:t>
+      </w:r>
+      <w:r>
+        <w:t xml:space="preserve"> </w:t>
+      </w:r>
+      <w:r>
+        <w:t xml:space="preserve">Supreme</w:t>
+      </w:r>
+      <w:r>
+        <w:t xml:space="preserve"> </w:t>
+      </w:r>
+      <w:r>
+        <w:t xml:space="preserve">Court</w:t>
+      </w:r>
+      <w:r>
+        <w:t xml:space="preserve"> </w:t>
+      </w:r>
+      <w:r>
+        <w:t xml:space="preserve">has</w:t>
+      </w:r>
+      <w:r>
+        <w:t xml:space="preserve"> </w:t>
+      </w:r>
+      <w:r>
+        <w:t xml:space="preserve">recognized</w:t>
+      </w:r>
+      <w:r>
+        <w:t xml:space="preserve"> </w:t>
+      </w:r>
+      <w:r>
+        <w:t xml:space="preserve">four</w:t>
+      </w:r>
+      <w:r>
+        <w:t xml:space="preserve"> </w:t>
+      </w:r>
+      <w:r>
+        <w:t xml:space="preserve">types:</w:t>
+      </w:r>
+      <w:r>
+        <w:t xml:space="preserve"> </w:t>
+      </w:r>
+      <w:r>
+        <w:t xml:space="preserve">the</w:t>
+      </w:r>
+      <w:r>
+        <w:t xml:space="preserve"> </w:t>
+      </w:r>
+      <w:r>
+        <w:t xml:space="preserve">traditional</w:t>
+      </w:r>
+      <w:r>
+        <w:t xml:space="preserve"> </w:t>
+      </w:r>
+      <w:r>
+        <w:t xml:space="preserve">public</w:t>
+      </w:r>
+      <w:r>
+        <w:t xml:space="preserve"> </w:t>
+      </w:r>
+      <w:r>
+        <w:t xml:space="preserve">forum,</w:t>
+      </w:r>
+      <w:r>
+        <w:t xml:space="preserve"> </w:t>
+      </w:r>
+      <w:r>
+        <w:t xml:space="preserve">the</w:t>
+      </w:r>
+      <w:r>
+        <w:t xml:space="preserve"> </w:t>
+      </w:r>
+      <w:r>
+        <w:t xml:space="preserve">designated</w:t>
+      </w:r>
+      <w:r>
+        <w:t xml:space="preserve"> </w:t>
+      </w:r>
+      <w:r>
+        <w:t xml:space="preserve">public</w:t>
+      </w:r>
+      <w:r>
+        <w:t xml:space="preserve"> </w:t>
+      </w:r>
+      <w:r>
+        <w:t xml:space="preserve">forum,</w:t>
+      </w:r>
+      <w:r>
+        <w:t xml:space="preserve"> </w:t>
+      </w:r>
+      <w:r>
+        <w:t xml:space="preserve">the</w:t>
+      </w:r>
+      <w:r>
+        <w:t xml:space="preserve"> </w:t>
+      </w:r>
+      <w:r>
+        <w:t xml:space="preserve">limited</w:t>
+      </w:r>
+      <w:r>
+        <w:t xml:space="preserve"> </w:t>
+      </w:r>
+      <w:r>
+        <w:t xml:space="preserve">public</w:t>
+      </w:r>
+      <w:r>
+        <w:t xml:space="preserve"> </w:t>
+      </w:r>
+      <w:r>
+        <w:t xml:space="preserve">forum,</w:t>
+      </w:r>
+      <w:r>
+        <w:t xml:space="preserve"> </w:t>
+      </w:r>
+      <w:r>
+        <w:t xml:space="preserve">and</w:t>
+      </w:r>
+      <w:r>
+        <w:t xml:space="preserve"> </w:t>
+      </w:r>
+      <w:r>
+        <w:t xml:space="preserve">the</w:t>
+      </w:r>
+      <w:r>
+        <w:t xml:space="preserve"> </w:t>
+      </w:r>
+      <w:r>
+        <w:t xml:space="preserve">nonpublic</w:t>
+      </w:r>
+      <w:r>
+        <w:t xml:space="preserve"> </w:t>
+      </w:r>
+      <w:r>
+        <w:t xml:space="preserve">forum.</w:t>
+      </w:r>
+      <w:r>
+        <w:t xml:space="preserve"> </w:t>
+      </w:r>
+      <w:r>
+        <w:t xml:space="preserve">See</w:t>
+      </w:r>
+      <w:r>
+        <w:t xml:space="preserve"> </w:t>
+      </w:r>
+      <w:r>
+        <w:t xml:space="preserve">Walker</w:t>
+      </w:r>
+      <w:r>
+        <w:t xml:space="preserve"> </w:t>
+      </w:r>
+      <w:r>
+        <w:t xml:space="preserve">v.</w:t>
+      </w:r>
+      <w:r>
+        <w:t xml:space="preserve"> </w:t>
+      </w:r>
+      <w:r>
+        <w:t xml:space="preserve">Texas</w:t>
+      </w:r>
+      <w:r>
+        <w:t xml:space="preserve"> </w:t>
+      </w:r>
+      <w:r>
+        <w:t xml:space="preserve">Div.,</w:t>
+      </w:r>
+      <w:r>
+        <w:t xml:space="preserve"> </w:t>
+      </w:r>
+      <w:r>
+        <w:t xml:space="preserve">Sons</w:t>
+      </w:r>
+      <w:r>
+        <w:t xml:space="preserve"> </w:t>
+      </w:r>
+      <w:r>
+        <w:t xml:space="preserve">of</w:t>
+      </w:r>
+      <w:r>
+        <w:t xml:space="preserve"> </w:t>
+      </w:r>
+      <w:r>
+        <w:t xml:space="preserve">Confederate</w:t>
+      </w:r>
+      <w:r>
+        <w:t xml:space="preserve"> </w:t>
+      </w:r>
+      <w:r>
+        <w:t xml:space="preserve">Veterans,</w:t>
+      </w:r>
+      <w:r>
+        <w:t xml:space="preserve"> </w:t>
+      </w:r>
+      <w:r>
+        <w:t xml:space="preserve">Inc.,</w:t>
+      </w:r>
+      <w:r>
+        <w:t xml:space="preserve"> </w:t>
+      </w:r>
+      <w:r>
+        <w:t xml:space="preserve">576</w:t>
+      </w:r>
+      <w:r>
+        <w:t xml:space="preserve"> </w:t>
+      </w:r>
+      <w:r>
+        <w:t xml:space="preserve">U.S.</w:t>
+      </w:r>
+      <w:r>
+        <w:t xml:space="preserve"> </w:t>
+      </w:r>
+      <w:r>
+        <w:t xml:space="preserve">200,</w:t>
+      </w:r>
+      <w:r>
+        <w:t xml:space="preserve"> </w:t>
+      </w:r>
+      <w:r>
+        <w:t xml:space="preserve">215</w:t>
+        <w:noBreakHyphen/>
+        <w:t xml:space="preserve">16,</w:t>
+      </w:r>
+      <w:r>
+        <w:t xml:space="preserve"> </w:t>
+      </w:r>
+      <w:r>
+        <w:t xml:space="preserve">135</w:t>
+      </w:r>
+      <w:r>
+        <w:t xml:space="preserve"> </w:t>
+      </w:r>
+      <w:r>
+        <w:t xml:space="preserve">S.</w:t>
+      </w:r>
+      <w:r>
+        <w:t xml:space="preserve"> </w:t>
+      </w:r>
+      <w:r>
+        <w:t xml:space="preserve">Ct.</w:t>
+      </w:r>
+      <w:r>
+        <w:t xml:space="preserve"> </w:t>
+      </w:r>
+      <w:r>
+        <w:t xml:space="preserve">2239,</w:t>
+      </w:r>
+      <w:r>
+        <w:t xml:space="preserve"> </w:t>
+      </w:r>
+      <w:r>
+        <w:t xml:space="preserve">192</w:t>
+      </w:r>
+      <w:r>
+        <w:t xml:space="preserve"> </w:t>
+      </w:r>
+      <w:r>
+        <w:t xml:space="preserve">L.</w:t>
+      </w:r>
+      <w:r>
+        <w:t xml:space="preserve"> </w:t>
+      </w:r>
+      <w:r>
+        <w:t xml:space="preserve">Ed.</w:t>
+      </w:r>
+      <w:r>
+        <w:t xml:space="preserve"> </w:t>
+      </w:r>
+      <w:r>
+        <w:t xml:space="preserve">2d</w:t>
+      </w:r>
+      <w:r>
+        <w:t xml:space="preserve"> </w:t>
+      </w:r>
+      <w:r>
+        <w:t xml:space="preserve">274</w:t>
+      </w:r>
+      <w:r>
+        <w:t xml:space="preserve"> </w:t>
+      </w:r>
+      <w:r>
+        <w:t xml:space="preserve">(2015).</w:t>
+      </w:r>
+      <w:r>
+        <w:t xml:space="preserve"> </w:t>
+      </w:r>
+      <w:r>
+        <w:t xml:space="preserve">Content</w:t>
+      </w:r>
+      <w:r>
+        <w:t xml:space="preserve"> </w:t>
+      </w:r>
+      <w:r>
+        <w:t xml:space="preserve">restrictions</w:t>
+      </w:r>
+      <w:r>
+        <w:t xml:space="preserve"> </w:t>
+      </w:r>
+      <w:r>
+        <w:t xml:space="preserve">in</w:t>
+      </w:r>
+      <w:r>
+        <w:t xml:space="preserve"> </w:t>
+      </w:r>
+      <w:r>
+        <w:t xml:space="preserve">the</w:t>
+      </w:r>
+      <w:r>
+        <w:t xml:space="preserve"> </w:t>
+      </w:r>
+      <w:r>
+        <w:t xml:space="preserve">first</w:t>
+      </w:r>
+      <w:r>
+        <w:t xml:space="preserve"> </w:t>
+      </w:r>
+      <w:r>
+        <w:t xml:space="preserve">two</w:t>
+      </w:r>
+      <w:r>
+        <w:t xml:space="preserve"> </w:t>
+      </w:r>
+      <w:r>
+        <w:t xml:space="preserve">categories</w:t>
+      </w:r>
+      <w:r>
+        <w:t xml:space="preserve"> </w:t>
+      </w:r>
+      <w:r>
+        <w:t xml:space="preserve">are</w:t>
+      </w:r>
+      <w:r>
+        <w:t xml:space="preserve"> </w:t>
+      </w:r>
+      <w:r>
+        <w:t xml:space="preserve">reviewed</w:t>
+      </w:r>
+      <w:r>
+        <w:t xml:space="preserve"> </w:t>
+      </w:r>
+      <w:r>
+        <w:t xml:space="preserve">under</w:t>
+      </w:r>
+      <w:r>
+        <w:t xml:space="preserve"> </w:t>
+      </w:r>
+      <w:r>
+        <w:t xml:space="preserve">strict</w:t>
+      </w:r>
+      <w:r>
+        <w:t xml:space="preserve"> </w:t>
+      </w:r>
+      <w:r>
+        <w:t xml:space="preserve">scrutiny,</w:t>
+      </w:r>
+      <w:r>
+        <w:t xml:space="preserve"> </w:t>
+      </w:r>
+      <w:r>
+        <w:t xml:space="preserve">while</w:t>
+      </w:r>
+      <w:r>
+        <w:t xml:space="preserve"> </w:t>
+      </w:r>
+      <w:r>
+        <w:t xml:space="preserve">regulations</w:t>
+      </w:r>
+      <w:r>
+        <w:t xml:space="preserve"> </w:t>
+      </w:r>
+      <w:r>
+        <w:t xml:space="preserve">in</w:t>
+      </w:r>
+      <w:r>
+        <w:t xml:space="preserve"> </w:t>
+      </w:r>
+      <w:r>
+        <w:t xml:space="preserve">the</w:t>
+      </w:r>
+      <w:r>
+        <w:t xml:space="preserve"> </w:t>
+      </w:r>
+      <w:r>
+        <w:t xml:space="preserve">latter</w:t>
+      </w:r>
+      <w:r>
+        <w:t xml:space="preserve"> </w:t>
+      </w:r>
+      <w:r>
+        <w:t xml:space="preserve">two</w:t>
+      </w:r>
+      <w:r>
+        <w:t xml:space="preserve"> </w:t>
+      </w:r>
+      <w:r>
+        <w:t xml:space="preserve">survive</w:t>
+      </w:r>
+      <w:r>
+        <w:t xml:space="preserve"> </w:t>
+      </w:r>
+      <w:r>
+        <w:t xml:space="preserve">so</w:t>
+      </w:r>
+      <w:r>
+        <w:t xml:space="preserve"> </w:t>
+      </w:r>
+      <w:r>
+        <w:t xml:space="preserve">long</w:t>
+      </w:r>
+      <w:r>
+        <w:t xml:space="preserve"> </w:t>
+      </w:r>
+      <w:r>
+        <w:t xml:space="preserve">as</w:t>
+      </w:r>
+      <w:r>
+        <w:t xml:space="preserve"> </w:t>
+      </w:r>
+      <w:r>
+        <w:t xml:space="preserve">they</w:t>
+      </w:r>
+      <w:r>
+        <w:t xml:space="preserve"> </w:t>
+      </w:r>
+      <w:r>
+        <w:t xml:space="preserve">are</w:t>
+      </w:r>
+      <w:r>
+        <w:t xml:space="preserve"> </w:t>
+      </w:r>
+      <w:r>
+        <w:t xml:space="preserve">viewpoint</w:t>
+      </w:r>
+      <w:r>
+        <w:t xml:space="preserve"> </w:t>
+      </w:r>
+      <w:r>
+        <w:t xml:space="preserve">neutral</w:t>
+      </w:r>
+      <w:r>
+        <w:t xml:space="preserve"> </w:t>
+      </w:r>
+      <w:r>
+        <w:t xml:space="preserve">and</w:t>
+      </w:r>
+      <w:r>
+        <w:t xml:space="preserve"> </w:t>
+      </w:r>
+      <w:r>
+        <w:t xml:space="preserve">reasonable.</w:t>
+      </w:r>
+      <w:r>
+        <w:t xml:space="preserve"> </w:t>
+      </w:r>
+      <w:r>
+        <w:t xml:space="preserve">McDonough</w:t>
+      </w:r>
+      <w:r>
+        <w:t xml:space="preserve"> </w:t>
+      </w:r>
+      <w:r>
+        <w:t xml:space="preserve">v.</w:t>
+      </w:r>
+      <w:r>
+        <w:t xml:space="preserve"> </w:t>
+      </w:r>
+      <w:r>
+        <w:t xml:space="preserve">Garcia,</w:t>
+      </w:r>
+      <w:r>
+        <w:t xml:space="preserve"> </w:t>
+      </w:r>
+      <w:r>
+        <w:t xml:space="preserve">116</w:t>
+      </w:r>
+      <w:r>
+        <w:t xml:space="preserve"> </w:t>
+      </w:r>
+      <w:r>
+        <w:t xml:space="preserve">F.4th</w:t>
+      </w:r>
+      <w:r>
+        <w:t xml:space="preserve"> </w:t>
+      </w:r>
+      <w:r>
+        <w:t xml:space="preserve">1319,</w:t>
+      </w:r>
+      <w:r>
+        <w:t xml:space="preserve"> </w:t>
+      </w:r>
+      <w:r>
+        <w:t xml:space="preserve">1322</w:t>
+      </w:r>
+      <w:r>
+        <w:t xml:space="preserve"> </w:t>
+      </w:r>
+      <w:r>
+        <w:t xml:space="preserve">(11th</w:t>
+      </w:r>
+      <w:r>
+        <w:t xml:space="preserve"> </w:t>
+      </w:r>
+      <w:r>
+        <w:t xml:space="preserve">Cir.</w:t>
+      </w:r>
+      <w:r>
+        <w:t xml:space="preserve"> </w:t>
+      </w:r>
+      <w:r>
+        <w:t xml:space="preserve">2024).</w:t>
+      </w:r>
+    </w:p>
+    <w:p>
+      <w:pPr>
+        <w:pStyle w:val="BodyText"/>
       </w:pPr>
       <w:r>
         <w:t xml:space="preserve">Here, as framed by the complaint, 244 Washington is a limited public forum. It is the building where PSC meetings are held. Because the forum is “one created for certain groups or for the discussion of certain topics” it is a limited public forum. McDonough, 116 F.4th at 1324 (citing and discussing Rosenberger v. Rector &amp; Visitors of the University of Virginia, 515 U.S. 819, 829 (1995)). Supreme Court precedent makes clear that in such a forum “the government ‘may impose restrictions on speech that are reasonable and viewpoint-neutral.’” Id. at 1328. As McDonough further explains, restrictions on speech in such a forum “must be reasonable in light of the purposes served by the meetings and may not discriminate on the basis of viewpoint.” 116 F.4th at 1329.</w:t>
@@ -587,19 +2845,102 @@
     <w:p>
       <w:pPr>
         <w:pStyle w:val="Heading2"/>
-      </w:pPr>
-      <w:bookmarkStart w:id="15" w:name="_4793871eb16fde879b88ba969a7476b236acac6"/>
-      <w:r>
-        <w:t xml:space="preserve">C. Count Two – Open Meetings Act</w:t>
-      </w:r>
-      <w:bookmarkEnd w:id="15"/>
-    </w:p>
-    <w:p>
-      <w:pPr>
-        <w:pStyle w:val="FirstParagraph"/>
-      </w:pPr>
-      <w:r>
-        <w:t xml:space="preserve">Ms. Durand’s claim under Georgia’s Open Meetings Act likewise fails for several reasons.</w:t>
+        <w:keepNext/>
+        <w:keepLines/>
+        <w:spacing w:before="322" w:after="322" w:line="322" w:lineRule="exact"/>
+        <w:ind w:left="0" w:firstLine="0"/>
+        <w:jc w:val="left"/>
+      </w:pPr>
+      <w:r>
+        <w:rPr>
+          <w:b/>
+          <w:bCs/>
+        </w:rPr>
+        <w:t xml:space="preserve">C.</w:t>
+      </w:r>
+      <w:r>
+        <w:rPr>
+          <w:b/>
+          <w:bCs/>
+        </w:rPr>
+        <w:t xml:space="preserve"> </w:t>
+      </w:r>
+      <w:r>
+        <w:rPr>
+          <w:b/>
+          <w:bCs/>
+        </w:rPr>
+        <w:t xml:space="preserve">Count</w:t>
+      </w:r>
+      <w:r>
+        <w:rPr>
+          <w:b/>
+          <w:bCs/>
+        </w:rPr>
+        <w:t xml:space="preserve"> </w:t>
+      </w:r>
+      <w:r>
+        <w:rPr>
+          <w:b/>
+          <w:bCs/>
+        </w:rPr>
+        <w:t xml:space="preserve">Two</w:t>
+      </w:r>
+      <w:r>
+        <w:rPr>
+          <w:b/>
+          <w:bCs/>
+        </w:rPr>
+        <w:t xml:space="preserve"> </w:t>
+      </w:r>
+      <w:r>
+        <w:rPr>
+          <w:b/>
+          <w:bCs/>
+        </w:rPr>
+        <w:t xml:space="preserve">–</w:t>
+      </w:r>
+      <w:r>
+        <w:rPr>
+          <w:b/>
+          <w:bCs/>
+        </w:rPr>
+        <w:t xml:space="preserve"> </w:t>
+      </w:r>
+      <w:r>
+        <w:rPr>
+          <w:b/>
+          <w:bCs/>
+        </w:rPr>
+        <w:t xml:space="preserve">Open</w:t>
+      </w:r>
+      <w:r>
+        <w:rPr>
+          <w:b/>
+          <w:bCs/>
+        </w:rPr>
+        <w:t xml:space="preserve"> </w:t>
+      </w:r>
+      <w:r>
+        <w:rPr>
+          <w:b/>
+          <w:bCs/>
+        </w:rPr>
+        <w:t xml:space="preserve">Meetings</w:t>
+      </w:r>
+      <w:r>
+        <w:rPr>
+          <w:b/>
+          <w:bCs/>
+        </w:rPr>
+        <w:t xml:space="preserve"> </w:t>
+      </w:r>
+      <w:r>
+        <w:rPr>
+          <w:b/>
+          <w:bCs/>
+        </w:rPr>
+        <w:t xml:space="preserve">Act</w:t>
       </w:r>
     </w:p>
     <w:p>
@@ -607,22 +2948,49 @@
         <w:pStyle w:val="BodyText"/>
       </w:pPr>
       <w:r>
-        <w:t xml:space="preserve">Initially, this Court lacks jurisdiction over this claim. The Act grants to Georgia’s Superior Courts the jurisdiction to enforce compliance with its provisions. See O.C.G.A. § 50-14-5(a) (“The superior courts of this state shall have jurisdiction to enforce compliance with the provisions of this chapter, including the power to grant injunctions or other equitable relief.”).</w:t>
+        <w:t xml:space="preserve">Ms. Durand’s claim under Georgia’s Open Meetings Act likewise fails for several reasons.</w:t>
+      </w:r>
+    </w:p>
+    <w:p>
+      <w:pPr>
+        <w:pStyle w:val="BodyText"/>
+      </w:pPr>
+      <w:r>
+        <w:t xml:space="preserve">Initially, this Court lacks jurisdiction over this claim. The Act grants to Georgia’s Superior Courts the jurisdiction to enforce compliance with its provisions. See O.C.G.A. § 50</w:t>
+      </w:r>
+      <w:r>
+        <w:noBreakHyphen/>
+      </w:r>
+      <w:r>
+        <w:t xml:space="preserve">14</w:t>
+      </w:r>
+      <w:r>
+        <w:noBreakHyphen/>
+      </w:r>
+      <w:r>
+        <w:t xml:space="preserve">5(a) (“The superior courts of this state shall have jurisdiction to enforce compliance with the provisions of this chapter, including the power to grant injunctions or other equitable relief.”).</w:t>
       </w:r>
     </w:p>
     <w:p>
       <w:pPr>
         <w:pStyle w:val="Heading1"/>
-      </w:pPr>
-      <w:bookmarkStart w:id="16" w:name="_conclusion"/>
-      <w:r>
+        <w:keepNext/>
+        <w:keepLines/>
+        <w:spacing w:before="322" w:after="322" w:line="322" w:lineRule="exact"/>
+        <w:ind w:left="0" w:firstLine="0"/>
+        <w:jc w:val="center"/>
+      </w:pPr>
+      <w:r>
+        <w:rPr>
+          <w:b/>
+          <w:bCs/>
+        </w:rPr>
         <w:t xml:space="preserve">CONCLUSION</w:t>
       </w:r>
-      <w:bookmarkEnd w:id="16"/>
-    </w:p>
-    <w:p>
-      <w:pPr>
-        <w:pStyle w:val="FirstParagraph"/>
+    </w:p>
+    <w:p>
+      <w:pPr>
+        <w:pStyle w:val="BodyText"/>
       </w:pPr>
       <w:r>
         <w:t xml:space="preserve">For the reason stated, Defendant Lieutenant Jason Hayes asks that this motion be granted and that the Court dismiss all claim in this action.</w:t>
@@ -630,7 +2998,11 @@
     </w:p>
     <w:p>
       <w:pPr>
-        <w:pStyle w:val="GANDSignatureLead"/>
+        <w:keepNext/>
+        <w:keepLines/>
+        <w:spacing w:before="644" w:after="0" w:line="322" w:lineRule="exact"/>
+        <w:ind w:left="0" w:firstLine="0"/>
+        <w:jc w:val="left"/>
       </w:pPr>
       <w:r>
         <w:t xml:space="preserve">Respectfully submitted,</w:t>
@@ -638,7 +3010,11 @@
     </w:p>
     <w:p>
       <w:pPr>
-        <w:pStyle w:val="GANDSignatureBlockLead"/>
+        <w:keepNext/>
+        <w:keepLines/>
+        <w:spacing w:before="644" w:after="0" w:line="322" w:lineRule="exact"/>
+        <w:ind w:left="3888" w:firstLine="0"/>
+        <w:jc w:val="left"/>
       </w:pPr>
       <w:r>
         <w:t xml:space="preserve">s/ Roger A. Chalmers</w:t>
@@ -646,7 +3022,11 @@
     </w:p>
     <w:p>
       <w:pPr>
-        <w:pStyle w:val="GANDSignatureBlock"/>
+        <w:keepNext/>
+        <w:keepLines/>
+        <w:spacing w:before="0" w:after="0" w:line="322" w:lineRule="exact"/>
+        <w:ind w:left="3888" w:firstLine="0"/>
+        <w:jc w:val="left"/>
       </w:pPr>
       <w:r>
         <w:t xml:space="preserve">Roger A. Chalmers, Georgia Bar No. 118720</w:t>
@@ -654,39 +3034,103 @@
     </w:p>
     <w:p>
       <w:pPr>
-        <w:pStyle w:val="GANDSignatureGap"/>
-      </w:pPr>
-      <w:r>
-        <w:t xml:space="preserve">State Law Department</w:t>
-      </w:r>
-    </w:p>
-    <w:p>
-      <w:pPr>
-        <w:pStyle w:val="GANDSignatureBlock"/>
-      </w:pPr>
-      <w:r>
-        <w:t xml:space="preserve">40 Capitol Square SW</w:t>
-      </w:r>
-    </w:p>
-    <w:p>
-      <w:pPr>
-        <w:pStyle w:val="GANDSignatureBlock"/>
-      </w:pPr>
-      <w:r>
-        <w:t xml:space="preserve">Atlanta, GA 30334</w:t>
-      </w:r>
-    </w:p>
-    <w:p>
-      <w:pPr>
-        <w:pStyle w:val="GANDSignatureBlock"/>
-      </w:pPr>
-      <w:r>
-        <w:t xml:space="preserve">Telephone: (404) 458-3220</w:t>
-      </w:r>
-    </w:p>
-    <w:p>
-      <w:pPr>
-        <w:pStyle w:val="GANDSignatureBlock"/>
+        <w:keepNext/>
+        <w:keepLines/>
+        <w:spacing w:before="80" w:after="0" w:line="322" w:lineRule="exact"/>
+        <w:ind w:left="3888" w:firstLine="0"/>
+        <w:jc w:val="left"/>
+      </w:pPr>
+      <w:r>
+        <w:t xml:space="preserve">State</w:t>
+      </w:r>
+      <w:r>
+        <w:t xml:space="preserve"> </w:t>
+      </w:r>
+      <w:r>
+        <w:t xml:space="preserve">Law</w:t>
+      </w:r>
+      <w:r>
+        <w:t xml:space="preserve"> </w:t>
+      </w:r>
+      <w:r>
+        <w:t xml:space="preserve">Department</w:t>
+      </w:r>
+    </w:p>
+    <w:p>
+      <w:pPr>
+        <w:keepNext/>
+        <w:keepLines/>
+        <w:spacing w:before="0" w:after="0" w:line="322" w:lineRule="exact"/>
+        <w:ind w:left="3888" w:firstLine="0"/>
+        <w:jc w:val="left"/>
+      </w:pPr>
+      <w:r>
+        <w:t xml:space="preserve">40</w:t>
+      </w:r>
+      <w:r>
+        <w:t xml:space="preserve"> </w:t>
+      </w:r>
+      <w:r>
+        <w:t xml:space="preserve">Capitol</w:t>
+      </w:r>
+      <w:r>
+        <w:t xml:space="preserve"> </w:t>
+      </w:r>
+      <w:r>
+        <w:t xml:space="preserve">Square</w:t>
+      </w:r>
+      <w:r>
+        <w:t xml:space="preserve"> </w:t>
+      </w:r>
+      <w:r>
+        <w:t xml:space="preserve">SW</w:t>
+      </w:r>
+    </w:p>
+    <w:p>
+      <w:pPr>
+        <w:keepNext/>
+        <w:keepLines/>
+        <w:spacing w:before="0" w:after="0" w:line="322" w:lineRule="exact"/>
+        <w:ind w:left="3888" w:firstLine="0"/>
+        <w:jc w:val="left"/>
+      </w:pPr>
+      <w:r>
+        <w:t xml:space="preserve">Atlanta,</w:t>
+      </w:r>
+      <w:r>
+        <w:t xml:space="preserve"> </w:t>
+      </w:r>
+      <w:r>
+        <w:t xml:space="preserve">GA</w:t>
+      </w:r>
+      <w:r>
+        <w:t xml:space="preserve"> </w:t>
+      </w:r>
+      <w:r>
+        <w:t xml:space="preserve">30334</w:t>
+      </w:r>
+    </w:p>
+    <w:p>
+      <w:pPr>
+        <w:keepNext/>
+        <w:keepLines/>
+        <w:spacing w:before="0" w:after="0" w:line="322" w:lineRule="exact"/>
+        <w:ind w:left="3888" w:firstLine="0"/>
+        <w:jc w:val="left"/>
+      </w:pPr>
+      <w:r>
+        <w:t xml:space="preserve">Telephone: (404) 458</w:t>
+        <w:noBreakHyphen/>
+        <w:t xml:space="preserve">3220</w:t>
+      </w:r>
+    </w:p>
+    <w:p>
+      <w:pPr>
+        <w:keepNext/>
+        <w:keepLines/>
+        <w:spacing w:before="0" w:after="0" w:line="322" w:lineRule="exact"/>
+        <w:ind w:left="3888" w:firstLine="0"/>
+        <w:jc w:val="left"/>
       </w:pPr>
       <w:r>
         <w:t xml:space="preserve">rchalmers@law.ga.gov</w:t>
@@ -694,23 +3138,61 @@
     </w:p>
     <w:p>
       <w:pPr>
-        <w:pStyle w:val="GANDSignatureGap"/>
-      </w:pPr>
-      <w:r>
-        <w:t xml:space="preserve">Counsel for Defendant Jason Hayes</w:t>
-      </w:r>
-    </w:p>
-    <w:p>
-      <w:pPr>
-        <w:pStyle w:val="GANDCertificateHeading"/>
-      </w:pPr>
-      <w:r>
+        <w:spacing w:before="80" w:after="0" w:line="322" w:lineRule="exact"/>
+        <w:ind w:left="3888" w:firstLine="0"/>
+        <w:jc w:val="left"/>
+      </w:pPr>
+      <w:r>
+        <w:t xml:space="preserve">Counsel</w:t>
+      </w:r>
+      <w:r>
+        <w:t xml:space="preserve"> </w:t>
+      </w:r>
+      <w:r>
+        <w:t xml:space="preserve">for</w:t>
+      </w:r>
+      <w:r>
+        <w:t xml:space="preserve"> </w:t>
+      </w:r>
+      <w:r>
+        <w:t xml:space="preserve">Defendant</w:t>
+      </w:r>
+      <w:r>
+        <w:t xml:space="preserve"> </w:t>
+      </w:r>
+      <w:r>
+        <w:t xml:space="preserve">Jason</w:t>
+      </w:r>
+      <w:r>
+        <w:t xml:space="preserve"> </w:t>
+      </w:r>
+      <w:r>
+        <w:t xml:space="preserve">Hayes</w:t>
+      </w:r>
+    </w:p>
+    <w:p>
+      <w:pPr>
+        <w:keepNext/>
+        <w:keepLines/>
+        <w:spacing w:before="644" w:after="322" w:line="322" w:lineRule="exact"/>
+        <w:ind w:left="0" w:firstLine="0"/>
+        <w:jc w:val="center"/>
+      </w:pPr>
+      <w:r>
+        <w:rPr>
+          <w:b/>
+          <w:bCs/>
+        </w:rPr>
         <w:t xml:space="preserve">CERTIFICATE PURSUANT TO LOCAL RULE 7.1(D)</w:t>
       </w:r>
     </w:p>
     <w:p>
       <w:pPr>
-        <w:pStyle w:val="GANDCertificateBody"/>
+        <w:keepNext/>
+        <w:keepLines/>
+        <w:spacing w:before="0" w:after="0" w:line="644" w:lineRule="exact"/>
+        <w:ind w:left="0" w:firstLine="720"/>
+        <w:jc w:val="left"/>
       </w:pPr>
       <w:r>
         <w:t xml:space="preserve">I certify that the foregoing brief conforms to the requirements of LR 5.1(C). The brief is prepared in 14-point Times New Roman font.</w:t>
@@ -718,7 +3200,9 @@
     </w:p>
     <w:p>
       <w:pPr>
-        <w:pStyle w:val="GANDSignatureRight"/>
+        <w:spacing w:before="644" w:after="0" w:line="322" w:lineRule="exact"/>
+        <w:ind w:left="0" w:firstLine="0"/>
+        <w:jc w:val="right"/>
       </w:pPr>
       <w:r>
         <w:t xml:space="preserve">s/ Roger A. Chalmers</w:t>
@@ -726,15 +3210,27 @@
     </w:p>
     <w:p>
       <w:pPr>
-        <w:pStyle w:val="GANDCertificateHeading"/>
-      </w:pPr>
-      <w:r>
+        <w:keepNext/>
+        <w:keepLines/>
+        <w:spacing w:before="644" w:after="322" w:line="322" w:lineRule="exact"/>
+        <w:ind w:left="0" w:firstLine="0"/>
+        <w:jc w:val="center"/>
+      </w:pPr>
+      <w:r>
+        <w:rPr>
+          <w:b/>
+          <w:bCs/>
+        </w:rPr>
         <w:t xml:space="preserve">CERTIFICATE OF SERVICE</w:t>
       </w:r>
     </w:p>
     <w:p>
       <w:pPr>
-        <w:pStyle w:val="GANDCertificateBody"/>
+        <w:keepNext/>
+        <w:keepLines/>
+        <w:spacing w:before="0" w:after="0" w:line="644" w:lineRule="exact"/>
+        <w:ind w:left="0" w:firstLine="720"/>
+        <w:jc w:val="left"/>
       </w:pPr>
       <w:r>
         <w:t xml:space="preserve">I certify that I have this day served the foregoing pleading with the Clerk of Court using the CM/ECF system which will automatically send email notification of such filing to all counsel of record.</w:t>
@@ -742,7 +3238,11 @@
     </w:p>
     <w:p>
       <w:pPr>
-        <w:pStyle w:val="GANDCertificateBody"/>
+        <w:keepNext/>
+        <w:keepLines/>
+        <w:spacing w:before="0" w:after="0" w:line="644" w:lineRule="exact"/>
+        <w:ind w:left="0" w:firstLine="720"/>
+        <w:jc w:val="left"/>
       </w:pPr>
       <w:r>
         <w:t xml:space="preserve">This 24th day of August, 2026.</w:t>
@@ -750,19 +3250,18 @@
     </w:p>
     <w:p>
       <w:pPr>
-        <w:pStyle w:val="GANDSignatureRight"/>
+        <w:spacing w:before="644" w:after="0" w:line="322" w:lineRule="exact"/>
+        <w:ind w:left="0" w:firstLine="0"/>
+        <w:jc w:val="right"/>
       </w:pPr>
       <w:r>
         <w:t xml:space="preserve">s/ Roger A. Chalmers</w:t>
       </w:r>
     </w:p>
     <w:sectPr>
-      <w:footerReference w:type="default" r:id="rIdGandFooter1"/>
-      <w:footnotePr>
-        <w:numRestart w:val="eachSect"/>
-      </w:footnotePr>
+      <w:footerReference w:type="default" r:id="rIdFooter1"/>
       <w:pgSz w:w="12240" w:h="15840"/>
-      <w:pgMar w:top="1440" w:right="1440" w:bottom="1440" w:left="1440" w:header="720" w:footer="720" w:gutter="0"/>
+      <w:pgMar w:top="1440" w:right="1440" w:bottom="1440" w:left="1440" w:header="720" w:footer="686" w:gutter="0"/>
     </w:sectPr>
   </w:body>
 </w:document>
@@ -776,47 +3275,21 @@
 <w:ftr xmlns:w="http://schemas.openxmlformats.org/wordprocessingml/2006/main" xmlns:r="http://schemas.openxmlformats.org/officeDocument/2006/relationships">
   <w:p>
     <w:pPr>
-      <w:spacing w:before="0" w:after="0" w:line="240" w:lineRule="auto"/>
       <w:jc w:val="center"/>
     </w:pPr>
     <w:r>
-      <w:rPr>
-        <w:rFonts w:ascii="Times New Roman" w:hAnsi="Times New Roman" w:eastAsia="Times New Roman" w:cs="Times New Roman"/>
-        <w:sz w:val="28"/>
-        <w:szCs w:val="28"/>
-      </w:rPr>
       <w:fldChar w:fldCharType="begin"/>
     </w:r>
     <w:r>
-      <w:rPr>
-        <w:rFonts w:ascii="Times New Roman" w:hAnsi="Times New Roman" w:eastAsia="Times New Roman" w:cs="Times New Roman"/>
-        <w:sz w:val="28"/>
-        <w:szCs w:val="28"/>
-      </w:rPr>
       <w:instrText xml:space="preserve"> PAGE </w:instrText>
     </w:r>
     <w:r>
-      <w:rPr>
-        <w:rFonts w:ascii="Times New Roman" w:hAnsi="Times New Roman" w:eastAsia="Times New Roman" w:cs="Times New Roman"/>
-        <w:sz w:val="28"/>
-        <w:szCs w:val="28"/>
-      </w:rPr>
       <w:fldChar w:fldCharType="separate"/>
     </w:r>
     <w:r>
-      <w:rPr>
-        <w:rFonts w:ascii="Times New Roman" w:hAnsi="Times New Roman" w:eastAsia="Times New Roman" w:cs="Times New Roman"/>
-        <w:sz w:val="28"/>
-        <w:szCs w:val="28"/>
-      </w:rPr>
       <w:t>1</w:t>
     </w:r>
     <w:r>
-      <w:rPr>
-        <w:rFonts w:ascii="Times New Roman" w:hAnsi="Times New Roman" w:eastAsia="Times New Roman" w:cs="Times New Roman"/>
-        <w:sz w:val="28"/>
-        <w:szCs w:val="28"/>
-      </w:rPr>
       <w:fldChar w:fldCharType="end"/>
     </w:r>
   </w:p>
@@ -839,7 +3312,7 @@
       </w:r>
     </w:p>
   </w:footnote>
-  <w:footnote w:id="11">
+  <w:footnote w:id="9">
     <w:p>
       <w:pPr>
         <w:pStyle w:val="FootnoteText"/>
@@ -951,14 +3424,15 @@
     <w:rPrDefault>
       <w:rPr>
         <w:rFonts w:ascii="Times New Roman" w:hAnsi="Times New Roman" w:eastAsia="Times New Roman" w:cs="Times New Roman"/>
-        <w:sz w:val="24"/>
-        <w:szCs w:val="24"/>
+        <w:sz w:val="28"/>
+        <w:szCs w:val="28"/>
         <w:lang w:val="en-US" w:eastAsia="zh-CN" w:bidi="ar-SA"/>
       </w:rPr>
     </w:rPrDefault>
     <w:pPrDefault>
       <w:pPr>
-        <w:spacing w:after="200"/>
+        <w:widowControl/>
+        <w:spacing w:after="0"/>
       </w:pPr>
     </w:pPrDefault>
   </w:docDefaults>
@@ -966,14 +3440,6 @@
   <w:style w:type="paragraph" w:default="1" w:styleId="Normal">
     <w:name w:val="Normal"/>
     <w:qFormat/>
-    <w:pPr>
-      <w:spacing w:before="0" w:after="0" w:line="240" w:lineRule="auto"/>
-    </w:pPr>
-    <w:rPr>
-      <w:rFonts w:ascii="Times New Roman" w:hAnsi="Times New Roman" w:eastAsia="Times New Roman" w:cs="Times New Roman"/>
-      <w:sz w:val="28"/>
-      <w:szCs w:val="28"/>
-    </w:rPr>
   </w:style>
   <w:style w:type="paragraph" w:styleId="BodyText">
     <w:name w:val="Body Text"/>
@@ -984,39 +3450,20 @@
       <w:spacing w:before="0" w:after="0" w:line="644" w:lineRule="exact"/>
       <w:ind w:firstLine="720"/>
     </w:pPr>
-    <w:rPr>
-      <w:rFonts w:ascii="Times New Roman" w:hAnsi="Times New Roman" w:eastAsia="Times New Roman" w:cs="Times New Roman"/>
-      <w:sz w:val="28"/>
-      <w:szCs w:val="28"/>
-    </w:rPr>
   </w:style>
   <w:style w:type="paragraph" w:customStyle="1" w:styleId="FirstParagraph">
     <w:name w:val="First Paragraph"/>
     <w:basedOn w:val="BodyText"/>
     <w:next w:val="BodyText"/>
     <w:qFormat/>
-    <w:pPr>
-      <w:spacing w:before="0" w:after="0" w:line="644" w:lineRule="exact"/>
-      <w:ind w:firstLine="720"/>
-    </w:pPr>
-    <w:rPr>
-      <w:rFonts w:ascii="Times New Roman" w:hAnsi="Times New Roman" w:eastAsia="Times New Roman" w:cs="Times New Roman"/>
-      <w:sz w:val="28"/>
-      <w:szCs w:val="28"/>
-    </w:rPr>
   </w:style>
   <w:style w:type="paragraph" w:customStyle="1" w:styleId="Compact">
     <w:name w:val="Compact"/>
     <w:basedOn w:val="BodyText"/>
     <w:qFormat/>
     <w:pPr>
-      <w:spacing w:before="0" w:after="0" w:line="644" w:lineRule="exact"/>
+      <w:spacing w:before="36" w:after="36"/>
     </w:pPr>
-    <w:rPr>
-      <w:rFonts w:ascii="Times New Roman" w:hAnsi="Times New Roman" w:eastAsia="Times New Roman" w:cs="Times New Roman"/>
-      <w:sz w:val="28"/>
-      <w:szCs w:val="28"/>
-    </w:rPr>
   </w:style>
   <w:style w:type="paragraph" w:styleId="Title">
     <w:name w:val="Title"/>
@@ -1027,12 +3474,12 @@
     <w:qFormat/>
     <w:rsid w:val="00A10FD9"/>
     <w:pPr>
-      <w:spacing w:before="0" w:after="0" w:line="240" w:lineRule="auto"/>
+      <w:spacing w:after="80" w:line="240" w:lineRule="auto"/>
       <w:contextualSpacing/>
       <w:jc w:val="center"/>
     </w:pPr>
     <w:rPr>
-      <w:rFonts w:ascii="Times New Roman" w:hAnsi="Times New Roman" w:eastAsia="Times New Roman" w:cs="Times New Roman"/>
+      <w:rFonts w:asciiTheme="majorHAnsi" w:eastAsiaTheme="majorEastAsia" w:hAnsiTheme="majorHAnsi" w:cstheme="majorBidi"/>
       <w:sz w:val="56"/>
       <w:szCs w:val="56"/>
     </w:rPr>
@@ -1044,7 +3491,7 @@
     <w:uiPriority w:val="10"/>
     <w:rsid w:val="00A10FD9"/>
     <w:rPr>
-      <w:rFonts w:ascii="Times New Roman" w:hAnsi="Times New Roman" w:eastAsia="Times New Roman" w:cs="Times New Roman"/>
+      <w:rFonts w:asciiTheme="majorHAnsi" w:eastAsiaTheme="majorEastAsia" w:hAnsiTheme="majorHAnsi" w:cstheme="majorBidi"/>
       <w:sz w:val="56"/>
       <w:szCs w:val="56"/>
     </w:rPr>
@@ -1063,7 +3510,7 @@
       </w:numPr>
     </w:pPr>
     <w:rPr>
-      <w:rFonts w:ascii="Times New Roman" w:hAnsi="Times New Roman" w:eastAsia="Times New Roman" w:cs="Times New Roman"/>
+      <w:rFonts w:eastAsiaTheme="majorEastAsia" w:cstheme="majorBidi"/>
       <w:spacing w:val="15"/>
       <w:sz w:val="28"/>
       <w:szCs w:val="28"/>
@@ -1076,8 +3523,8 @@
     <w:uiPriority w:val="11"/>
     <w:rsid w:val="00A10FD9"/>
     <w:rPr>
-      <w:rFonts w:ascii="Times New Roman" w:hAnsi="Times New Roman" w:eastAsia="Times New Roman" w:cs="Times New Roman"/>
-      <w:color w:val="000000"/>
+      <w:rFonts w:eastAsiaTheme="majorEastAsia" w:cstheme="majorBidi"/>
+      <w:color w:val="595959" w:themeColor="text1" w:themeTint="A6"/>
       <w:spacing w:val="15"/>
       <w:sz w:val="28"/>
       <w:szCs w:val="28"/>
@@ -1162,14 +3609,17 @@
     <w:pPr>
       <w:keepNext/>
       <w:keepLines/>
-      <w:spacing w:before="644" w:after="644" w:line="240" w:lineRule="auto"/>
+      <w:spacing w:before="322" w:after="322" w:line="322" w:lineRule="exact"/>
+      <w:ind w:firstLine="0"/>
       <w:jc w:val="center"/>
+      <w:outlineLvl w:val="0"/>
     </w:pPr>
     <w:rPr>
       <w:rFonts w:ascii="Times New Roman" w:hAnsi="Times New Roman" w:eastAsia="Times New Roman" w:cs="Times New Roman"/>
       <w:b/>
       <w:bCs/>
       <w:caps/>
+      <w:color w:val="000000"/>
       <w:sz w:val="28"/>
       <w:szCs w:val="28"/>
     </w:rPr>
@@ -1187,13 +3637,15 @@
     <w:pPr>
       <w:keepNext/>
       <w:keepLines/>
-      <w:spacing w:before="644" w:after="644" w:line="240" w:lineRule="auto"/>
-      <w:jc w:val="left"/>
+      <w:spacing w:before="322" w:after="322" w:line="322" w:lineRule="exact"/>
+      <w:ind w:firstLine="0"/>
+      <w:outlineLvl w:val="1"/>
     </w:pPr>
     <w:rPr>
       <w:rFonts w:ascii="Times New Roman" w:hAnsi="Times New Roman" w:eastAsia="Times New Roman" w:cs="Times New Roman"/>
       <w:b/>
       <w:bCs/>
+      <w:color w:val="000000"/>
       <w:sz w:val="28"/>
       <w:szCs w:val="28"/>
     </w:rPr>
@@ -1211,12 +3663,15 @@
     <w:pPr>
       <w:keepNext/>
       <w:keepLines/>
-      <w:spacing w:before="644" w:after="644" w:line="240" w:lineRule="auto"/>
+      <w:spacing w:before="322" w:after="322" w:line="322" w:lineRule="exact"/>
+      <w:ind w:firstLine="0"/>
+      <w:outlineLvl w:val="2"/>
     </w:pPr>
     <w:rPr>
       <w:rFonts w:ascii="Times New Roman" w:hAnsi="Times New Roman" w:eastAsia="Times New Roman" w:cs="Times New Roman"/>
       <w:b/>
       <w:bCs/>
+      <w:color w:val="000000"/>
       <w:sz w:val="28"/>
       <w:szCs w:val="28"/>
     </w:rPr>
@@ -1234,14 +3689,18 @@
     <w:pPr>
       <w:keepNext/>
       <w:keepLines/>
-      <w:spacing w:before="80" w:after="40"/>
+      <w:spacing w:before="322" w:after="322" w:line="322" w:lineRule="exact"/>
+      <w:ind w:firstLine="0"/>
       <w:outlineLvl w:val="3"/>
     </w:pPr>
     <w:rPr>
       <w:rFonts w:ascii="Times New Roman" w:hAnsi="Times New Roman" w:eastAsia="Times New Roman" w:cs="Times New Roman"/>
+      <w:b/>
+      <w:bCs/>
       <w:i/>
-      <w:iCs/>
       <w:color w:val="000000"/>
+      <w:sz w:val="28"/>
+      <w:szCs w:val="28"/>
     </w:rPr>
   </w:style>
   <w:style w:type="paragraph" w:styleId="Heading5">
@@ -1257,12 +3716,18 @@
     <w:pPr>
       <w:keepNext/>
       <w:keepLines/>
-      <w:spacing w:before="80" w:after="40"/>
+      <w:spacing w:before="322" w:after="322" w:line="322" w:lineRule="exact"/>
+      <w:ind w:firstLine="0"/>
       <w:outlineLvl w:val="4"/>
     </w:pPr>
     <w:rPr>
       <w:rFonts w:ascii="Times New Roman" w:hAnsi="Times New Roman" w:eastAsia="Times New Roman" w:cs="Times New Roman"/>
+      <w:b/>
+      <w:bCs/>
+      <w:i/>
       <w:color w:val="000000"/>
+      <w:sz w:val="28"/>
+      <w:szCs w:val="28"/>
     </w:rPr>
   </w:style>
   <w:style w:type="paragraph" w:styleId="Heading6">
@@ -1282,10 +3747,10 @@
       <w:outlineLvl w:val="5"/>
     </w:pPr>
     <w:rPr>
-      <w:rFonts w:ascii="Times New Roman" w:hAnsi="Times New Roman" w:eastAsia="Times New Roman" w:cs="Times New Roman"/>
+      <w:rFonts w:eastAsiaTheme="majorEastAsia" w:cstheme="majorBidi"/>
       <w:i/>
       <w:iCs/>
-      <w:color w:val="000000"/>
+      <w:color w:val="595959" w:themeColor="text1" w:themeTint="A6"/>
     </w:rPr>
   </w:style>
   <w:style w:type="paragraph" w:styleId="Heading7">
@@ -1305,8 +3770,8 @@
       <w:outlineLvl w:val="6"/>
     </w:pPr>
     <w:rPr>
-      <w:rFonts w:ascii="Times New Roman" w:hAnsi="Times New Roman" w:eastAsia="Times New Roman" w:cs="Times New Roman"/>
-      <w:color w:val="000000"/>
+      <w:rFonts w:eastAsiaTheme="majorEastAsia" w:cstheme="majorBidi"/>
+      <w:color w:val="595959" w:themeColor="text1" w:themeTint="A6"/>
     </w:rPr>
   </w:style>
   <w:style w:type="paragraph" w:styleId="Heading8">
@@ -1326,10 +3791,10 @@
       <w:outlineLvl w:val="7"/>
     </w:pPr>
     <w:rPr>
-      <w:rFonts w:ascii="Times New Roman" w:hAnsi="Times New Roman" w:eastAsia="Times New Roman" w:cs="Times New Roman"/>
+      <w:rFonts w:eastAsiaTheme="majorEastAsia" w:cstheme="majorBidi"/>
       <w:i/>
       <w:iCs/>
-      <w:color w:val="000000"/>
+      <w:color w:val="272727" w:themeColor="text1" w:themeTint="D8"/>
     </w:rPr>
   </w:style>
   <w:style w:type="paragraph" w:styleId="Heading9">
@@ -1349,8 +3814,8 @@
       <w:outlineLvl w:val="8"/>
     </w:pPr>
     <w:rPr>
-      <w:rFonts w:ascii="Times New Roman" w:hAnsi="Times New Roman" w:eastAsia="Times New Roman" w:cs="Times New Roman"/>
-      <w:color w:val="000000"/>
+      <w:rFonts w:eastAsiaTheme="majorEastAsia" w:cstheme="majorBidi"/>
+      <w:color w:val="272727" w:themeColor="text1" w:themeTint="D8"/>
     </w:rPr>
   </w:style>
   <w:style w:type="character" w:customStyle="1" w:styleId="Heading1Char">
@@ -1360,8 +3825,8 @@
     <w:uiPriority w:val="9"/>
     <w:rsid w:val="00A10FD9"/>
     <w:rPr>
-      <w:rFonts w:ascii="Times New Roman" w:hAnsi="Times New Roman" w:eastAsia="Times New Roman" w:cs="Times New Roman"/>
-      <w:color w:val="000000"/>
+      <w:rFonts w:asciiTheme="majorHAnsi" w:eastAsiaTheme="majorEastAsia" w:hAnsiTheme="majorHAnsi" w:cstheme="majorBidi"/>
+      <w:color w:val="0F4761" w:themeColor="accent1" w:themeShade="BF"/>
       <w:sz w:val="40"/>
       <w:szCs w:val="40"/>
     </w:rPr>
@@ -1374,8 +3839,8 @@
     <w:semiHidden/>
     <w:rsid w:val="00A10FD9"/>
     <w:rPr>
-      <w:rFonts w:ascii="Times New Roman" w:hAnsi="Times New Roman" w:eastAsia="Times New Roman" w:cs="Times New Roman"/>
-      <w:color w:val="000000"/>
+      <w:rFonts w:asciiTheme="majorHAnsi" w:eastAsiaTheme="majorEastAsia" w:hAnsiTheme="majorHAnsi" w:cstheme="majorBidi"/>
+      <w:color w:val="0F4761" w:themeColor="accent1" w:themeShade="BF"/>
       <w:sz w:val="32"/>
       <w:szCs w:val="32"/>
     </w:rPr>
@@ -1388,8 +3853,8 @@
     <w:semiHidden/>
     <w:rsid w:val="00A10FD9"/>
     <w:rPr>
-      <w:rFonts w:ascii="Times New Roman" w:hAnsi="Times New Roman" w:eastAsia="Times New Roman" w:cs="Times New Roman"/>
-      <w:color w:val="000000"/>
+      <w:rFonts w:eastAsiaTheme="majorEastAsia" w:cstheme="majorBidi"/>
+      <w:color w:val="0F4761" w:themeColor="accent1" w:themeShade="BF"/>
       <w:sz w:val="28"/>
       <w:szCs w:val="28"/>
     </w:rPr>
@@ -1402,10 +3867,10 @@
     <w:semiHidden/>
     <w:rsid w:val="00A10FD9"/>
     <w:rPr>
-      <w:rFonts w:ascii="Times New Roman" w:hAnsi="Times New Roman" w:eastAsia="Times New Roman" w:cs="Times New Roman"/>
+      <w:rFonts w:eastAsiaTheme="majorEastAsia" w:cstheme="majorBidi"/>
       <w:i/>
       <w:iCs/>
-      <w:color w:val="000000"/>
+      <w:color w:val="0F4761" w:themeColor="accent1" w:themeShade="BF"/>
     </w:rPr>
   </w:style>
   <w:style w:type="character" w:customStyle="1" w:styleId="Heading5Char">
@@ -1416,8 +3881,8 @@
     <w:semiHidden/>
     <w:rsid w:val="00A10FD9"/>
     <w:rPr>
-      <w:rFonts w:ascii="Times New Roman" w:hAnsi="Times New Roman" w:eastAsia="Times New Roman" w:cs="Times New Roman"/>
-      <w:color w:val="000000"/>
+      <w:rFonts w:eastAsiaTheme="majorEastAsia" w:cstheme="majorBidi"/>
+      <w:color w:val="0F4761" w:themeColor="accent1" w:themeShade="BF"/>
     </w:rPr>
   </w:style>
   <w:style w:type="character" w:customStyle="1" w:styleId="Heading6Char">
@@ -1428,10 +3893,10 @@
     <w:semiHidden/>
     <w:rsid w:val="00A10FD9"/>
     <w:rPr>
-      <w:rFonts w:ascii="Times New Roman" w:hAnsi="Times New Roman" w:eastAsia="Times New Roman" w:cs="Times New Roman"/>
+      <w:rFonts w:eastAsiaTheme="majorEastAsia" w:cstheme="majorBidi"/>
       <w:i/>
       <w:iCs/>
-      <w:color w:val="000000"/>
+      <w:color w:val="595959" w:themeColor="text1" w:themeTint="A6"/>
     </w:rPr>
   </w:style>
   <w:style w:type="character" w:customStyle="1" w:styleId="Heading7Char">
@@ -1442,8 +3907,8 @@
     <w:semiHidden/>
     <w:rsid w:val="00A10FD9"/>
     <w:rPr>
-      <w:rFonts w:ascii="Times New Roman" w:hAnsi="Times New Roman" w:eastAsia="Times New Roman" w:cs="Times New Roman"/>
-      <w:color w:val="000000"/>
+      <w:rFonts w:eastAsiaTheme="majorEastAsia" w:cstheme="majorBidi"/>
+      <w:color w:val="595959" w:themeColor="text1" w:themeTint="A6"/>
     </w:rPr>
   </w:style>
   <w:style w:type="character" w:customStyle="1" w:styleId="Heading8Char">
@@ -1454,10 +3919,10 @@
     <w:semiHidden/>
     <w:rsid w:val="00A10FD9"/>
     <w:rPr>
-      <w:rFonts w:ascii="Times New Roman" w:hAnsi="Times New Roman" w:eastAsia="Times New Roman" w:cs="Times New Roman"/>
+      <w:rFonts w:eastAsiaTheme="majorEastAsia" w:cstheme="majorBidi"/>
       <w:i/>
       <w:iCs/>
-      <w:color w:val="000000"/>
+      <w:color w:val="272727" w:themeColor="text1" w:themeTint="D8"/>
     </w:rPr>
   </w:style>
   <w:style w:type="character" w:customStyle="1" w:styleId="Heading9Char">
@@ -1468,9 +3933,18 @@
     <w:semiHidden/>
     <w:rsid w:val="00A10FD9"/>
     <w:rPr>
-      <w:rFonts w:ascii="Times New Roman" w:hAnsi="Times New Roman" w:eastAsia="Times New Roman" w:cs="Times New Roman"/>
-      <w:color w:val="000000"/>
-    </w:rPr>
+      <w:rFonts w:eastAsiaTheme="majorEastAsia" w:cstheme="majorBidi"/>
+      <w:color w:val="272727" w:themeColor="text1" w:themeTint="D8"/>
+    </w:rPr>
+  </w:style>
+  <w:style w:type="paragraph" w:customStyle="1" w:styleId="ListItem">
+    <w:name w:val="List Item"/>
+    <w:basedOn w:val="BodyText"/>
+    <w:qFormat/>
+    <w:pPr>
+      <w:spacing w:before="0" w:after="0" w:line="644" w:lineRule="exact"/>
+      <w:ind w:left="720" w:hanging="720"/>
+    </w:pPr>
   </w:style>
   <w:style w:type="paragraph" w:styleId="BlockText">
     <w:name w:val="Block Text"/>
@@ -1480,14 +3954,9 @@
     <w:unhideWhenUsed/>
     <w:qFormat/>
     <w:pPr>
-      <w:spacing w:before="0" w:after="644" w:line="240" w:lineRule="auto"/>
-      <w:ind w:left="720" w:right="720"/>
+      <w:spacing w:before="280" w:after="280" w:line="322" w:lineRule="exact"/>
+      <w:ind w:firstLine="0" w:left="720" w:right="720"/>
     </w:pPr>
-    <w:rPr>
-      <w:rFonts w:ascii="Times New Roman" w:hAnsi="Times New Roman" w:eastAsia="Times New Roman" w:cs="Times New Roman"/>
-      <w:sz w:val="28"/>
-      <w:szCs w:val="28"/>
-    </w:rPr>
   </w:style>
   <w:style w:type="paragraph" w:styleId="FootnoteText">
     <w:name w:val="Footnote Text"/>
@@ -1497,10 +3966,10 @@
     <w:unhideWhenUsed/>
     <w:qFormat/>
     <w:pPr>
-      <w:spacing w:before="0" w:after="80" w:line="240" w:lineRule="auto"/>
+      <w:keepLines/>
+      <w:spacing w:before="0" w:after="140" w:line="322" w:lineRule="exact"/>
     </w:pPr>
     <w:rPr>
-      <w:rFonts w:ascii="Times New Roman" w:hAnsi="Times New Roman" w:eastAsia="Times New Roman" w:cs="Times New Roman"/>
       <w:sz w:val="28"/>
       <w:szCs w:val="28"/>
     </w:rPr>
@@ -1513,8 +3982,8 @@
     <w:unhideWhenUsed/>
     <w:qFormat/>
     <w:pPr>
-      <w:spacing w:before="100" w:after="100"/>
-      <w:ind w:firstLine="0" w:left="480" w:right="480"/>
+      <w:spacing w:before="280" w:after="280"/>
+      <w:ind w:firstLine="0" w:left="720" w:right="720"/>
     </w:pPr>
   </w:style>
   <w:style w:type="character" w:default="1" w:styleId="DefaultParagraphFont">
@@ -1603,7 +4072,7 @@
     <w:name w:val="Verbatim Char"/>
     <w:basedOn w:val="BodyTextChar"/>
     <w:rPr>
-      <w:rFonts w:ascii="Times New Roman" w:hAnsi="Times New Roman" w:eastAsia="Times New Roman" w:cs="Times New Roman"/>
+      <w:rFonts w:ascii="Consolas" w:hAnsi="Consolas"/>
       <w:sz w:val="22"/>
     </w:rPr>
   </w:style>
@@ -1637,215 +4106,10 @@
       <w:outlineLvl w:val="9"/>
     </w:pPr>
     <w:rPr>
-      <w:rFonts w:ascii="Times New Roman" w:hAnsi="Times New Roman" w:eastAsia="Times New Roman" w:cs="Times New Roman"/>
+      <w:rFonts w:asciiTheme="majorHAnsi" w:eastAsiaTheme="majorEastAsia" w:hAnsiTheme="majorHAnsi" w:cstheme="majorBidi"/>
       <w:b w:val="0"/>
       <w:bCs w:val="0"/>
-      <w:color w:val="000000"/>
-    </w:rPr>
-  </w:style>
-  <w:style w:type="paragraph" w:customStyle="1" w:styleId="GANDNumbered">
-    <w:name w:val="GAND Numbered"/>
-    <w:basedOn w:val="BodyText"/>
-    <w:qFormat/>
-    <w:pPr>
-      <w:tabs>
-        <w:tab w:val="left" w:pos="1440"/>
-      </w:tabs>
-      <w:spacing w:before="0" w:after="0" w:line="644" w:lineRule="exact"/>
-      <w:ind w:firstLine="720"/>
-    </w:pPr>
-    <w:rPr>
-      <w:rFonts w:ascii="Times New Roman" w:hAnsi="Times New Roman" w:eastAsia="Times New Roman" w:cs="Times New Roman"/>
-      <w:sz w:val="28"/>
-      <w:szCs w:val="28"/>
-    </w:rPr>
-  </w:style>
-  <w:style w:type="paragraph" w:customStyle="1" w:styleId="GANDLettered">
-    <w:name w:val="GAND Lettered"/>
-    <w:basedOn w:val="BodyText"/>
-    <w:qFormat/>
-    <w:pPr>
-      <w:tabs>
-        <w:tab w:val="left" w:pos="1440"/>
-      </w:tabs>
-      <w:spacing w:before="0" w:after="0" w:line="644" w:lineRule="exact"/>
-      <w:ind w:left="1440" w:hanging="720"/>
-    </w:pPr>
-    <w:rPr>
-      <w:rFonts w:ascii="Times New Roman" w:hAnsi="Times New Roman" w:eastAsia="Times New Roman" w:cs="Times New Roman"/>
-      <w:sz w:val="28"/>
-      <w:szCs w:val="28"/>
-    </w:rPr>
-  </w:style>
-  <w:style w:type="paragraph" w:customStyle="1" w:styleId="GANDCourtTitle">
-    <w:name w:val="GAND Court Title"/>
-    <w:basedOn w:val="Normal"/>
-    <w:qFormat/>
-    <w:pPr>
-      <w:keepNext/>
-      <w:keepLines/>
-      <w:spacing w:before="0" w:after="0" w:line="240" w:lineRule="auto"/>
-      <w:jc w:val="center"/>
-    </w:pPr>
-    <w:rPr>
-      <w:rFonts w:ascii="Times New Roman" w:hAnsi="Times New Roman" w:eastAsia="Times New Roman" w:cs="Times New Roman"/>
-      <w:b/>
-      <w:bCs/>
-      <w:sz w:val="28"/>
-      <w:szCs w:val="28"/>
-    </w:rPr>
-  </w:style>
-  <w:style w:type="paragraph" w:customStyle="1" w:styleId="GANDCourtTitleLast">
-    <w:name w:val="GAND Court Title Last"/>
-    <w:basedOn w:val="GANDCourtTitle"/>
-    <w:qFormat/>
-    <w:pPr>
-      <w:spacing w:before="0" w:after="644" w:line="240" w:lineRule="auto"/>
-    </w:pPr>
-    <w:rPr/>
-  </w:style>
-  <w:style w:type="paragraph" w:customStyle="1" w:styleId="GANDCoverTitle">
-    <w:name w:val="GAND Cover Title"/>
-    <w:basedOn w:val="Normal"/>
-    <w:qFormat/>
-    <w:pPr>
-      <w:keepNext/>
-      <w:keepLines/>
-      <w:spacing w:before="644" w:after="644" w:line="240" w:lineRule="auto"/>
-      <w:jc w:val="center"/>
-    </w:pPr>
-    <w:rPr>
-      <w:rFonts w:ascii="Times New Roman" w:hAnsi="Times New Roman" w:eastAsia="Times New Roman" w:cs="Times New Roman"/>
-      <w:b/>
-      <w:bCs/>
-      <w:caps/>
-      <w:sz w:val="28"/>
-      <w:szCs w:val="28"/>
-    </w:rPr>
-  </w:style>
-  <w:style w:type="paragraph" w:customStyle="1" w:styleId="GANDCaption">
-    <w:name w:val="GAND Caption"/>
-    <w:basedOn w:val="Normal"/>
-    <w:qFormat/>
-    <w:pPr>
-      <w:spacing w:before="0" w:after="0" w:line="392" w:lineRule="exact"/>
-    </w:pPr>
-    <w:rPr>
-      <w:rFonts w:ascii="Times New Roman" w:hAnsi="Times New Roman" w:eastAsia="Times New Roman" w:cs="Times New Roman"/>
-      <w:sz w:val="28"/>
-      <w:szCs w:val="28"/>
-    </w:rPr>
-  </w:style>
-  <w:style w:type="paragraph" w:customStyle="1" w:styleId="GANDSignatureLead">
-    <w:name w:val="GAND Signature Lead"/>
-    <w:basedOn w:val="Normal"/>
-    <w:qFormat/>
-    <w:pPr>
-      <w:keepNext/>
-      <w:keepLines/>
-      <w:spacing w:before="644" w:after="0" w:line="240" w:lineRule="auto"/>
-    </w:pPr>
-    <w:rPr>
-      <w:rFonts w:ascii="Times New Roman" w:hAnsi="Times New Roman" w:eastAsia="Times New Roman" w:cs="Times New Roman"/>
-      <w:sz w:val="28"/>
-      <w:szCs w:val="28"/>
-    </w:rPr>
-  </w:style>
-  <w:style w:type="paragraph" w:customStyle="1" w:styleId="GANDSignatureBlockLead">
-    <w:name w:val="GAND Signature Block Lead"/>
-    <w:basedOn w:val="Normal"/>
-    <w:qFormat/>
-    <w:pPr>
-      <w:keepNext/>
-      <w:keepLines/>
-      <w:spacing w:before="644" w:after="0" w:line="240" w:lineRule="auto"/>
-      <w:ind w:left="3888"/>
-    </w:pPr>
-    <w:rPr>
-      <w:rFonts w:ascii="Times New Roman" w:hAnsi="Times New Roman" w:eastAsia="Times New Roman" w:cs="Times New Roman"/>
-      <w:sz w:val="28"/>
-      <w:szCs w:val="28"/>
-    </w:rPr>
-  </w:style>
-  <w:style w:type="paragraph" w:customStyle="1" w:styleId="GANDSignatureBlock">
-    <w:name w:val="GAND Signature Block"/>
-    <w:basedOn w:val="Normal"/>
-    <w:qFormat/>
-    <w:pPr>
-      <w:keepNext/>
-      <w:keepLines/>
-      <w:spacing w:before="0" w:after="0" w:line="240" w:lineRule="auto"/>
-      <w:ind w:left="3888"/>
-    </w:pPr>
-    <w:rPr>
-      <w:rFonts w:ascii="Times New Roman" w:hAnsi="Times New Roman" w:eastAsia="Times New Roman" w:cs="Times New Roman"/>
-      <w:sz w:val="28"/>
-      <w:szCs w:val="28"/>
-    </w:rPr>
-  </w:style>
-  <w:style w:type="paragraph" w:customStyle="1" w:styleId="GANDSignatureGap">
-    <w:name w:val="GAND Signature Gap"/>
-    <w:basedOn w:val="Normal"/>
-    <w:qFormat/>
-    <w:pPr>
-      <w:keepNext/>
-      <w:keepLines/>
-      <w:spacing w:before="80" w:after="0" w:line="240" w:lineRule="auto"/>
-      <w:ind w:left="3888"/>
-    </w:pPr>
-    <w:rPr>
-      <w:rFonts w:ascii="Times New Roman" w:hAnsi="Times New Roman" w:eastAsia="Times New Roman" w:cs="Times New Roman"/>
-      <w:sz w:val="28"/>
-      <w:szCs w:val="28"/>
-    </w:rPr>
-  </w:style>
-  <w:style w:type="paragraph" w:customStyle="1" w:styleId="GANDSignatureRight">
-    <w:name w:val="GAND Signature Right"/>
-    <w:basedOn w:val="Normal"/>
-    <w:qFormat/>
-    <w:pPr>
-      <w:keepLines/>
-      <w:spacing w:before="0" w:after="0" w:line="240" w:lineRule="auto"/>
-      <w:jc w:val="right"/>
-    </w:pPr>
-    <w:rPr>
-      <w:rFonts w:ascii="Times New Roman" w:hAnsi="Times New Roman" w:eastAsia="Times New Roman" w:cs="Times New Roman"/>
-      <w:sz w:val="28"/>
-      <w:szCs w:val="28"/>
-    </w:rPr>
-  </w:style>
-  <w:style w:type="paragraph" w:customStyle="1" w:styleId="GANDCertificateHeading">
-    <w:name w:val="GAND Certificate Heading"/>
-    <w:basedOn w:val="Normal"/>
-    <w:qFormat/>
-    <w:pPr>
-      <w:keepNext/>
-      <w:keepLines/>
-      <w:spacing w:before="644" w:after="644" w:line="240" w:lineRule="auto"/>
-      <w:jc w:val="center"/>
-    </w:pPr>
-    <w:rPr>
-      <w:rFonts w:ascii="Times New Roman" w:hAnsi="Times New Roman" w:eastAsia="Times New Roman" w:cs="Times New Roman"/>
-      <w:b/>
-      <w:bCs/>
-      <w:sz w:val="28"/>
-      <w:szCs w:val="28"/>
-    </w:rPr>
-  </w:style>
-  <w:style w:type="paragraph" w:customStyle="1" w:styleId="GANDCertificateBody">
-    <w:name w:val="GAND Certificate Body"/>
-    <w:basedOn w:val="BodyText"/>
-    <w:qFormat/>
-    <w:pPr>
-      <w:keepNext/>
-      <w:keepLines/>
-      <w:spacing w:before="0" w:after="644" w:line="644" w:lineRule="exact"/>
-      <w:ind w:firstLine="720"/>
-    </w:pPr>
-    <w:rPr>
-      <w:rFonts w:ascii="Times New Roman" w:hAnsi="Times New Roman" w:eastAsia="Times New Roman" w:cs="Times New Roman"/>
-      <w:sz w:val="28"/>
-      <w:szCs w:val="28"/>
+      <w:color w:val="365F91" w:themeColor="accent1" w:themeShade="BF"/>
     </w:rPr>
   </w:style>
   <w:style w:type="paragraph" w:customStyle="1" w:styleId="SourceCode">

</xml_diff>